<commit_message>
Twelve-gates review: all tracked changes accepted
GEX-12Gates-Multi-Party-Review_Good.docx with every tracked change accepted
(JML, 2026-10-22): the second §11 removed, "Who verifies" in the front
section, stale facts and fused text corrected, "Open challenges" in §9, the
four body paragraphs styled as headings returned to normal text. No tracked
markup left; passes the Word validator; the four 30 September comments kept.
The table of contents still needs refreshing in Word.

Co-Authored-By: Claude Opus 5.5 <noreply@anthropic.com>
</commit_message>
<xml_diff>
--- a/gex-platform-enhanced/docs/GEX-12Gates-Multi-Party-Review_Good.docx
+++ b/gex-platform-enhanced/docs/GEX-12Gates-Multi-Party-Review_Good.docx
@@ -36,26 +36,14 @@
       <w:pPr>
         <w:spacing w:after="360"/>
       </w:pPr>
-      <w:del w:id="9001" w:author="Claude" w:date="2026-10-21T17:00:00Z">
-        <w:r>
-          <w:rPr>
-            <w:color w:val="3A4A46"/>
-            <w:sz w:val="26"/>
-            <w:szCs w:val="26"/>
-          </w:rPr>
-          <w:delText>A multi-stakeholder critique of the GEX bankability framework</w:delText>
-        </w:r>
-      </w:del>
-      <w:ins w:id="9002" w:author="Claude" w:date="2026-10-21T17:00:00Z">
-        <w:r>
-          <w:rPr>
-            <w:color w:val="3A4A46"/>
-            <w:sz w:val="26"/>
-            <w:szCs w:val="26"/>
-          </w:rPr>
-          <w:t>The GEX evidence rules as built, and the multi-party challenge that shaped them</w:t>
-        </w:r>
-      </w:ins>
+      <w:r>
+        <w:rPr>
+          <w:color w:val="3A4A46"/>
+          <w:sz w:val="26"/>
+          <w:szCs w:val="26"/>
+        </w:rPr>
+        <w:t>The GEX evidence rules as built, and the multi-party challenge that shaped them</w:t>
+      </w:r>
       <w:r>
         <w:rPr>
           <w:color w:val="3A4A46"/>
@@ -244,24 +232,13 @@
               </w:rPr>
               <w:t xml:space="preserve">Evidence: a documented fact from a filing, statute, official document, company release or reputable press report. Source listed in </w:t>
             </w:r>
-            <w:del w:id="9003" w:author="Claude" w:date="2026-10-21T17:00:00Z">
-              <w:r>
-                <w:rPr>
-                  <w:sz w:val="18"/>
-                  <w:szCs w:val="18"/>
-                </w:rPr>
-                <w:delText>section 10</w:delText>
-              </w:r>
-            </w:del>
-            <w:ins w:id="9004" w:author="Claude" w:date="2026-10-21T17:00:00Z">
-              <w:r>
-                <w:rPr>
-                  <w:sz w:val="18"/>
-                  <w:szCs w:val="18"/>
-                </w:rPr>
-                <w:t>section 11</w:t>
-              </w:r>
-            </w:ins>
+            <w:r>
+              <w:rPr>
+                <w:sz w:val="18"/>
+                <w:szCs w:val="18"/>
+              </w:rPr>
+              <w:t>section 11</w:t>
+            </w:r>
             <w:r>
               <w:rPr>
                 <w:sz w:val="18"/>
@@ -460,24 +437,13 @@
             <w:pPr>
               <w:spacing w:after="40"/>
             </w:pPr>
-            <w:del w:id="9005" w:author="Claude" w:date="2026-10-21T17:00:00Z">
-              <w:r>
-                <w:rPr>
-                  <w:sz w:val="18"/>
-                  <w:szCs w:val="18"/>
-                </w:rPr>
-                <w:delText>My inference</w:delText>
-              </w:r>
-            </w:del>
-            <w:ins w:id="9006" w:author="Claude" w:date="2026-10-21T17:00:00Z">
-              <w:r>
-                <w:rPr>
-                  <w:sz w:val="18"/>
-                  <w:szCs w:val="18"/>
-                </w:rPr>
-                <w:t>GEX inference</w:t>
-              </w:r>
-            </w:ins>
+            <w:r>
+              <w:rPr>
+                <w:sz w:val="18"/>
+                <w:szCs w:val="18"/>
+              </w:rPr>
+              <w:t>GEX inference</w:t>
+            </w:r>
             <w:r>
               <w:rPr>
                 <w:sz w:val="18"/>
@@ -551,24 +517,13 @@
               </w:rPr>
               <w:t>Verified in the GEX engine or database</w:t>
             </w:r>
-            <w:del w:id="9007" w:author="Claude" w:date="2026-10-21T17:00:00Z">
-              <w:r>
-                <w:rPr>
-                  <w:sz w:val="18"/>
-                  <w:szCs w:val="18"/>
-                </w:rPr>
-                <w:delText xml:space="preserve"> on 27 September 2026.</w:delText>
-              </w:r>
-            </w:del>
-            <w:ins w:id="9008" w:author="Claude" w:date="2026-10-21T17:00:00Z">
-              <w:r>
-                <w:rPr>
-                  <w:sz w:val="18"/>
-                  <w:szCs w:val="18"/>
-                </w:rPr>
-                <w:t>; rules re-verified 21 October 2026, unchanged since 29 September.</w:t>
-              </w:r>
-            </w:ins>
+            <w:r>
+              <w:rPr>
+                <w:sz w:val="18"/>
+                <w:szCs w:val="18"/>
+              </w:rPr>
+              <w:t>; rules re-verified 21 October 2026, unchanged since 29 September.</w:t>
+            </w:r>
           </w:p>
         </w:tc>
       </w:tr>
@@ -2322,16 +2277,9 @@
       <w:r>
         <w:t xml:space="preserve">This is GEX’s reference for anyone approaching the platform: producer, offtaker, lender, equity investor, development-finance institution, EPC contractor, certifier or insurer. </w:t>
       </w:r>
-      <w:del w:id="9009" w:author="Claude" w:date="2026-10-21T17:00:00Z">
-        <w:r>
-          <w:delText xml:space="preserve">This section states the rules as they run on 30 September 2026. Sections 1 to 9 keep the multi-party review of 27 September 2026 that produced them, as the reasoning behind each rule; where the software differs from what the review proposed, an “As built” note says so.</w:delText>
-        </w:r>
-      </w:del>
-      <w:ins w:id="9010" w:author="Claude" w:date="2026-10-21T17:00:00Z">
-        <w:r>
-          <w:t>This section states the rules as they run on 21 October 2026, unchanged since rules 4.1.0. Sections 1 to 9 keep the multi-party challenge of 27 September 2026 that produced them: GEX testing its own framework against every party’s view and against the market. Where the software differs from what the challenge proposed, section 8.2 says so.</w:t>
-        </w:r>
-      </w:ins>
+      <w:r>
+        <w:t>This section states the rules as they run on 21 October 2026, unchanged since rules 4.1.0. Sections 1 to 9 keep the multi-party challenge of 27 September 2026 that produced them: GEX testing its own framework against every party’s view and against the market. Where the software differs from what the challenge proposed, section 8.2 says so.</w:t>
+      </w:r>
       <w:r>
         <w:t xml:space="preserve"> </w:t>
       </w:r>
@@ -2444,36 +2392,32 @@
           <w:numId w:val="3"/>
         </w:numPr>
         <w:spacing w:after="70"/>
+        <w:rPr/>
+      </w:pPr>
+      <w:r>
         <w:rPr>
-          <w:ins w:id="9011" w:author="Claude" w:date="2026-10-21T17:00:00Z"/>
+          <w:b/>
+          <w:bCs/>
         </w:rPr>
-      </w:pPr>
-      <w:ins w:id="9012" w:author="Claude" w:date="2026-10-21T17:00:00Z">
-        <w:r>
-          <w:rPr>
-            <w:b/>
-            <w:bCs/>
-          </w:rPr>
-          <w:t>Who verifies.</w:t>
-        </w:r>
-        <w:r>
-          <w:rPr>
-            <w:b/>
-            <w:bCs/>
-          </w:rPr>
-          <w:t xml:space="preserve"> Evidence is verified by a reviewer assigned to the project for that gate: never the party that submitted it, never its company, never the project’s owner, and never GEX. A certifier verifies G2 and G11; the independent engineer G0, G1, G3, G5, G6 and G11; the lenders’ adviser G0, G4 and G7 to G10; the insurer G7. At the early gates the capital provider’s own reviewer verifies the gate that makes its decision eligible: a grant body’s assessor G0, a seed investor’s adviser G1, a strategic investor’s adviser G3. Every verification names the document it attests to. </w:t>
-        </w:r>
-        <w:r>
-          <w:rPr>
-            <w:b/>
-            <w:bCs/>
-            <w:color w:val="3A4A46"/>
-            <w:sz w:val="18"/>
-            <w:szCs w:val="18"/>
-          </w:rPr>
-          <w:t>[GEX]</w:t>
-        </w:r>
-      </w:ins>
+        <w:t>Who verifies.</w:t>
+      </w:r>
+      <w:r>
+        <w:rPr>
+          <w:b/>
+          <w:bCs/>
+        </w:rPr>
+        <w:t xml:space="preserve"> Evidence is verified by a reviewer assigned to the project for that gate: never the party that submitted it, never its company, never the project’s owner, and never GEX. A certifier verifies G2 and G11; the independent engineer G0, G1, G3, G5, G6 and G11; the lenders’ adviser G0, G4 and G7 to G10; the insurer G7. At the early gates the capital provider’s own reviewer verifies the gate that makes its decision eligible: a grant body’s assessor G0, a seed investor’s adviser G1, a strategic investor’s adviser G3. Every verification names the document it attests to. </w:t>
+      </w:r>
+      <w:r>
+        <w:rPr>
+          <w:b/>
+          <w:bCs/>
+          <w:color w:val="3A4A46"/>
+          <w:sz w:val="18"/>
+          <w:szCs w:val="18"/>
+        </w:rPr>
+        <w:t>[GEX]</w:t>
+      </w:r>
     </w:p>
     <w:p>
       <w:pPr>
@@ -4115,31 +4059,22 @@
         <w:tab/>
         <w:t xml:space="preserve">Test 2 is </w:t>
       </w:r>
-      <w:del w:id="9013" w:author="Claude" w:date="2026-10-21T17:00:00Z">
-        <w:r>
-          <w:delText xml:space="preserve">the convergence the GEX mantra (Done now since 27Sep).</w:delText>
-        </w:r>
-      </w:del>
-      <w:ins w:id="9014" w:author="Claude" w:date="2026-10-21T17:00:00Z">
-        <w:r>
-          <w:t>whether the commitments converge: the GEX mantra, computed since rules 4.0.0 (section 8.4).</w:t>
-        </w:r>
-      </w:ins>
+      <w:r>
+        <w:t>whether the commitments converge: the GEX mantra, computed since rules 4.0.0 (section 8.4).</w:t>
+      </w:r>
       <w:r>
         <w:t xml:space="preserve"> </w:t>
       </w:r>
-      <w:ins w:id="3" w:author="Claude" w:date="2026-09-30T09:00:00Z">
-        <w:r>
-          <w:rPr>
-            <w:b/>
-            <w:bCs/>
-            <w:color w:val="3A4A46"/>
-            <w:sz w:val="18"/>
-            <w:szCs w:val="18"/>
-          </w:rPr>
-          <w:t>[GEX]</w:t>
-        </w:r>
-      </w:ins>
+      <w:r>
+        <w:rPr>
+          <w:b/>
+          <w:bCs/>
+          <w:color w:val="3A4A46"/>
+          <w:sz w:val="18"/>
+          <w:szCs w:val="18"/>
+        </w:rPr>
+        <w:t>[GEX]</w:t>
+      </w:r>
     </w:p>
     <w:p>
       <w:pPr>
@@ -4151,16 +4086,9 @@
       <w:r>
         <w:t xml:space="preserve">1.2 </w:t>
       </w:r>
-      <w:del w:id="9015" w:author="Claude" w:date="2026-10-21T17:00:00Z">
-        <w:r>
-          <w:delText>Six Gates facts</w:delText>
-        </w:r>
-      </w:del>
-      <w:ins w:id="9016" w:author="Claude" w:date="2026-10-21T17:00:00Z">
-        <w:r>
-          <w:t>Six Gates facts, as of 27 September 2026</w:t>
-        </w:r>
-      </w:ins>
+      <w:r>
+        <w:t>Six Gates facts, as of 27 September 2026</w:t>
+      </w:r>
       <w:bookmarkEnd w:id="4"/>
     </w:p>
     <w:p>
@@ -4171,29 +4099,25 @@
           <w:numId w:val="2"/>
         </w:numPr>
         <w:spacing w:after="80"/>
+        <w:rPr/>
+      </w:pPr>
+      <w:r>
         <w:rPr>
-          <w:ins w:id="9017" w:author="Claude" w:date="2026-10-21T17:00:00Z"/>
+          <w:b/>
+          <w:bCs/>
         </w:rPr>
-      </w:pPr>
-      <w:ins w:id="9018" w:author="Claude" w:date="2026-10-21T17:00:00Z">
-        <w:r>
-          <w:rPr>
-            <w:b/>
-            <w:bCs/>
-          </w:rPr>
-          <w:t xml:space="preserve">The engine as the challenge found it, before rules 4.0.0. All six were addressed (section 1.6); they stay here because they explain why the gates look as they do. </w:t>
-        </w:r>
-        <w:r>
-          <w:rPr>
-            <w:b/>
-            <w:bCs/>
-            <w:color w:val="3A4A46"/>
-            <w:sz w:val="18"/>
-            <w:szCs w:val="18"/>
-          </w:rPr>
-          <w:t>[GEX]</w:t>
-        </w:r>
-      </w:ins>
+        <w:t xml:space="preserve">The engine as the challenge found it, before rules 4.0.0. All six were addressed (section 1.6); they stay here because they explain why the gates look as they do. </w:t>
+      </w:r>
+      <w:r>
+        <w:rPr>
+          <w:b/>
+          <w:bCs/>
+          <w:color w:val="3A4A46"/>
+          <w:sz w:val="18"/>
+          <w:szCs w:val="18"/>
+        </w:rPr>
+        <w:t>[GEX]</w:t>
+      </w:r>
     </w:p>
     <w:p>
       <w:pPr>
@@ -4721,32 +4645,17 @@
         </w:rPr>
         <w:t xml:space="preserve"> </w:t>
       </w:r>
-      <w:del w:id="9019" w:author="Claude" w:date="2026-10-21T17:00:00Z">
-        <w:r>
-          <w:rPr>
-            <w:rFonts w:ascii="Avenir Next Condensed Ultra Lig" w:hAnsi="Avenir Next Condensed Ultra Lig"/>
-            <w:i/>
-            <w:iCs/>
-            <w:color w:val="EE0000"/>
-            <w:sz w:val="16"/>
-            <w:szCs w:val="16"/>
-          </w:rPr>
-          <w:delText>When asked why, European Climate, Infrastructure and Environment Executive Agency (CINEA) officials confirmed that developers</w:delText>
-        </w:r>
-      </w:del>
-      <w:ins w:id="9020" w:author="Claude" w:date="2026-10-21T17:00:00Z">
-        <w:r>
-          <w:rPr>
-            <w:rFonts w:ascii="Avenir Next Condensed Ultra Lig" w:hAnsi="Avenir Next Condensed Ultra Lig"/>
-            <w:i/>
-            <w:iCs/>
-            <w:color w:val="EE0000"/>
-            <w:sz w:val="16"/>
-            <w:szCs w:val="16"/>
-          </w:rPr>
-          <w:t>the European Commission said that they</w:t>
-        </w:r>
-      </w:ins>
+      <w:r>
+        <w:rPr>
+          <w:rFonts w:ascii="Avenir Next Condensed Ultra Lig" w:hAnsi="Avenir Next Condensed Ultra Lig"/>
+          <w:i/>
+          <w:iCs/>
+          <w:color w:val="EE0000"/>
+          <w:sz w:val="16"/>
+          <w:szCs w:val="16"/>
+        </w:rPr>
+        <w:t>the European Commission said that they</w:t>
+      </w:r>
       <w:r>
         <w:rPr>
           <w:rFonts w:ascii="Avenir Next Condensed Ultra Lig" w:hAnsi="Avenir Next Condensed Ultra Lig"/>
@@ -4758,58 +4667,28 @@
         </w:rPr>
         <w:t xml:space="preserve"> “chose not to proceed with the grant agreement procedure or were unable to provide the signed completion guarantee” </w:t>
       </w:r>
-      <w:del w:id="9021" w:author="Claude" w:date="2026-10-21T17:00:00Z">
-        <w:r>
-          <w:rPr>
-            <w:rFonts w:ascii="Avenir Next Condensed Ultra Lig" w:hAnsi="Avenir Next Condensed Ultra Lig"/>
-            <w:i/>
-            <w:iCs/>
-            <w:color w:val="EE0000"/>
-            <w:sz w:val="16"/>
-            <w:szCs w:val="16"/>
-          </w:rPr>
-          <w:delText>(a bank guarantee equal to 8–10% of the subsidy amount)</w:delText>
-        </w:r>
-      </w:del>
-      <w:ins w:id="9022" w:author="Claude" w:date="2026-10-21T17:00:00Z">
-        <w:r>
-          <w:rPr>
-            <w:rFonts w:ascii="Avenir Next Condensed Ultra Lig" w:hAnsi="Avenir Next Condensed Ultra Lig"/>
-            <w:i/>
-            <w:iCs/>
-            <w:color w:val="EE0000"/>
-            <w:sz w:val="16"/>
-            <w:szCs w:val="16"/>
-          </w:rPr>
-          <w:t>(a guarantee of 8% of the maximum grant)</w:t>
-        </w:r>
-      </w:ins>
-      <w:del w:id="9023" w:author="Claude" w:date="2026-10-21T17:00:00Z">
-        <w:r>
-          <w:rPr>
-            <w:rFonts w:ascii="Avenir Next Condensed Ultra Lig" w:hAnsi="Avenir Next Condensed Ultra Lig"/>
-            <w:i/>
-            <w:iCs/>
-            <w:color w:val="EE0000"/>
-            <w:sz w:val="16"/>
-            <w:szCs w:val="16"/>
-          </w:rPr>
-          <w:delText xml:space="preserve"> due to permitting bottlenecks, grid delays, and unviable power purchase agreement (PPA) pricing, with permitting and infrastructure delays among the reasons</w:delText>
-        </w:r>
-      </w:del>
-      <w:ins w:id="9024" w:author="Claude" w:date="2026-10-21T17:00:00Z">
-        <w:r>
-          <w:rPr>
-            <w:rFonts w:ascii="Avenir Next Condensed Ultra Lig" w:hAnsi="Avenir Next Condensed Ultra Lig"/>
-            <w:i/>
-            <w:iCs/>
-            <w:color w:val="EE0000"/>
-            <w:sz w:val="16"/>
-            <w:szCs w:val="16"/>
-          </w:rPr>
-          <w:t>; the companies cited policy and infrastructure delays and uncertainty (section 10)</w:t>
-        </w:r>
-      </w:ins>
+      <w:r>
+        <w:rPr>
+          <w:rFonts w:ascii="Avenir Next Condensed Ultra Lig" w:hAnsi="Avenir Next Condensed Ultra Lig"/>
+          <w:i/>
+          <w:iCs/>
+          <w:color w:val="EE0000"/>
+          <w:sz w:val="16"/>
+          <w:szCs w:val="16"/>
+        </w:rPr>
+        <w:t>(a guarantee of 8% of the maximum grant)</w:t>
+      </w:r>
+      <w:r>
+        <w:rPr>
+          <w:rFonts w:ascii="Avenir Next Condensed Ultra Lig" w:hAnsi="Avenir Next Condensed Ultra Lig"/>
+          <w:i/>
+          <w:iCs/>
+          <w:color w:val="EE0000"/>
+          <w:sz w:val="16"/>
+          <w:szCs w:val="16"/>
+        </w:rPr>
+        <w:t>; the companies cited policy and infrastructure delays and uncertainty (section 10)</w:t>
+      </w:r>
       <w:r>
         <w:rPr>
           <w:rFonts w:ascii="Avenir Next Condensed Ultra Lig" w:hAnsi="Avenir Next Condensed Ultra Lig"/>
@@ -4986,72 +4865,37 @@
         </w:rPr>
         <w:t xml:space="preserve">GEX’s early screening gates unlock early equity, VC, and public grants, </w:t>
       </w:r>
-      <w:del w:id="9025" w:author="Claude" w:date="2026-10-21T17:00:00Z">
-        <w:r>
-          <w:rPr>
-            <w:rFonts w:asciiTheme="minorHAnsi" w:hAnsiTheme="minorHAnsi" w:cstheme="minorHAnsi"/>
-            <w:color w:val="000000"/>
-            <w:sz w:val="21"/>
-            <w:szCs w:val="21"/>
-          </w:rPr>
-          <w:delText>yet fail to test the fundamental technical criteria that technology-equity investors actually require.</w:delText>
-        </w:r>
-        <w:r>
-          <w:delText xml:space="preserve"> </w:delText>
-        </w:r>
-        <w:r>
-          <w:rPr>
-            <w:rFonts w:asciiTheme="minorHAnsi" w:hAnsiTheme="minorHAnsi" w:cstheme="minorHAnsi"/>
-            <w:color w:val="000000"/>
-            <w:sz w:val="21"/>
-            <w:szCs w:val="21"/>
-          </w:rPr>
-          <w:delText xml:space="preserve">. G1 tests the technology basis. </w:delText>
-        </w:r>
-        <w:r>
-          <w:rPr>
-            <w:b/>
-            <w:bCs/>
-            <w:color w:val="8A5F06"/>
-            <w:sz w:val="18"/>
-            <w:szCs w:val="18"/>
-          </w:rPr>
-          <w:delText>[O]</w:delText>
-        </w:r>
-      </w:del>
-      <w:ins w:id="9026" w:author="Claude" w:date="2026-10-21T17:00:00Z">
-        <w:r>
-          <w:rPr>
-            <w:rFonts w:asciiTheme="minorHAnsi" w:hAnsiTheme="minorHAnsi" w:cstheme="minorHAnsi"/>
-            <w:color w:val="000000"/>
-            <w:sz w:val="21"/>
-            <w:szCs w:val="21"/>
-          </w:rPr>
-          <w:t xml:space="preserve">yet did not test the technical criteria that technology-equity investors require; since rules 4.0.0, G1 tests the technology basis. </w:t>
-        </w:r>
-        <w:r>
-          <w:rPr>
-            <w:rFonts w:asciiTheme="minorHAnsi" w:hAnsiTheme="minorHAnsi" w:cstheme="minorHAnsi"/>
-            <w:b/>
-            <w:bCs/>
-            <w:color w:val="8A5F06"/>
-            <w:sz w:val="18"/>
-            <w:szCs w:val="18"/>
-          </w:rPr>
-          <w:t>[O]</w:t>
-        </w:r>
-        <w:r>
-          <w:rPr>
-            <w:rFonts w:asciiTheme="minorHAnsi" w:hAnsiTheme="minorHAnsi" w:cstheme="minorHAnsi"/>
-            <w:b/>
-            <w:bCs/>
-            <w:color w:val="3A4A46"/>
-            <w:sz w:val="18"/>
-            <w:szCs w:val="18"/>
-          </w:rPr>
-          <w:t>[GEX]</w:t>
-        </w:r>
-      </w:ins>
+      <w:r>
+        <w:rPr>
+          <w:rFonts w:asciiTheme="minorHAnsi" w:hAnsiTheme="minorHAnsi" w:cstheme="minorHAnsi"/>
+          <w:color w:val="000000"/>
+          <w:sz w:val="21"/>
+          <w:szCs w:val="21"/>
+        </w:rPr>
+        <w:t xml:space="preserve">yet did not test the technical criteria that technology-equity investors require; since rules 4.0.0, G1 tests the technology basis. </w:t>
+      </w:r>
+      <w:r>
+        <w:rPr>
+          <w:rFonts w:asciiTheme="minorHAnsi" w:hAnsiTheme="minorHAnsi" w:cstheme="minorHAnsi"/>
+          <w:b/>
+          <w:bCs/>
+          <w:color w:val="8A5F06"/>
+          <w:sz w:val="18"/>
+          <w:szCs w:val="18"/>
+        </w:rPr>
+        <w:t>[O]</w:t>
+      </w:r>
+      <w:r>
+        <w:rPr>
+          <w:rFonts w:asciiTheme="minorHAnsi" w:hAnsiTheme="minorHAnsi" w:cstheme="minorHAnsi"/>
+          <w:b/>
+          <w:bCs/>
+          <w:color w:val="3A4A46"/>
+          <w:sz w:val="18"/>
+          <w:szCs w:val="18"/>
+        </w:rPr>
+        <w:t>[GEX]</w:t>
+      </w:r>
     </w:p>
     <w:p>
       <w:pPr>
@@ -5210,16 +5054,9 @@
       <w:r>
         <w:t xml:space="preserve"> They do sign binding agreements before FID, but conditionally. Uniper’s September 2026 e-SAF contract with Arcadia is “legally binding, while the commencement of deliveries remains subject to agreed conditions precedent and the eSAF facility commencing commercial operations”. Yara contracted 100% of Atome’s output on take-or-pay before FID. RWE and TotalEnergies (2025) and TotalEnergies and Air Products (2024) contracted hydrogen for deliveries from 2030. What sophisticated buyers do not give is an unconditional obligation without conditions precedent, longstop dates and delay remedies. </w:t>
       </w:r>
-      <w:del w:id="9027" w:author="Claude" w:date="2026-10-21T17:00:00Z">
-        <w:r>
-          <w:delText xml:space="preserve">Your proposition is right</w:delText>
-        </w:r>
-      </w:del>
-      <w:ins w:id="9028" w:author="Claude" w:date="2026-10-21T17:00:00Z">
-        <w:r>
-          <w:t>GEX’s original proposition was right</w:t>
-        </w:r>
-      </w:ins>
+      <w:r>
+        <w:t>GEX’s original proposition was right</w:t>
+      </w:r>
       <w:r>
         <w:t xml:space="preserve"> about unconditional commitments and wrong about binding ones. </w:t>
       </w:r>
@@ -5472,72 +5309,40 @@
               </w:rPr>
               <w:t xml:space="preserve">The decisive question is not “is the offtake signed?” but “are the conditions in each commitment the maturity milestones evidenced elsewhere, and are the dates, volumes and remedies consistent across contracts?” </w:t>
             </w:r>
-            <w:del w:id="9029" w:author="Claude" w:date="2026-10-21T17:00:00Z">
-              <w:r>
-                <w:rPr>
-                  <w:sz w:val="19"/>
-                  <w:szCs w:val="19"/>
-                </w:rPr>
-                <w:delText xml:space="preserve">.GEX computes</w:delText>
-              </w:r>
-            </w:del>
-            <w:ins w:id="9030" w:author="Claude" w:date="2026-10-21T17:00:00Z">
-              <w:r>
-                <w:rPr>
-                  <w:sz w:val="19"/>
-                  <w:szCs w:val="19"/>
-                </w:rPr>
-                <w:t>. GEX computes</w:t>
-              </w:r>
-            </w:ins>
             <w:r>
               <w:rPr>
                 <w:sz w:val="19"/>
                 <w:szCs w:val="19"/>
               </w:rPr>
+              <w:t>. GEX computes</w:t>
+            </w:r>
+            <w:r>
+              <w:rPr>
+                <w:sz w:val="19"/>
+                <w:szCs w:val="19"/>
+              </w:rPr>
               <w:t xml:space="preserve"> that, since rules 4.0.0, for the commitments recorded on its cards (section 8.4). Nobody else in the chain holds all the documents at once. </w:t>
             </w:r>
-            <w:del w:id="9031" w:author="Claude" w:date="2026-10-21T17:00:00Z">
-              <w:r>
-                <w:rPr>
-                  <w:sz w:val="19"/>
-                  <w:szCs w:val="19"/>
-                </w:rPr>
-                <w:delText xml:space="preserve">[I][GEX]. </w:delText>
-              </w:r>
-              <w:r>
-                <w:rPr>
-                  <w:b/>
-                  <w:bCs/>
-                  <w:color w:val="A8341A"/>
-                  <w:sz w:val="16"/>
-                  <w:szCs w:val="16"/>
-                </w:rPr>
-                <w:delText>[I]</w:delText>
-              </w:r>
-            </w:del>
-            <w:ins w:id="9032" w:author="Claude" w:date="2026-10-21T17:00:00Z">
-              <w:r>
-                <w:rPr>
-                  <w:b/>
-                  <w:bCs/>
-                  <w:color w:val="A8341A"/>
-                  <w:sz w:val="16"/>
-                  <w:szCs w:val="16"/>
-                </w:rPr>
-                <w:t>[I]</w:t>
-              </w:r>
-              <w:r>
-                <w:rPr>
-                  <w:b/>
-                  <w:bCs/>
-                  <w:color w:val="3A4A46"/>
-                  <w:sz w:val="16"/>
-                  <w:szCs w:val="16"/>
-                </w:rPr>
-                <w:t>[GEX]</w:t>
-              </w:r>
-            </w:ins>
+            <w:r>
+              <w:rPr>
+                <w:b/>
+                <w:bCs/>
+                <w:color w:val="A8341A"/>
+                <w:sz w:val="16"/>
+                <w:szCs w:val="16"/>
+              </w:rPr>
+              <w:t>[I]</w:t>
+            </w:r>
+            <w:r>
+              <w:rPr>
+                <w:b/>
+                <w:bCs/>
+                <w:color w:val="3A4A46"/>
+                <w:sz w:val="16"/>
+                <w:szCs w:val="16"/>
+              </w:rPr>
+              <w:t>[GEX]</w:t>
+            </w:r>
           </w:p>
         </w:tc>
       </w:tr>
@@ -5624,16 +5429,9 @@
       <w:r>
         <w:t>Every item is tagged with the lenses it serves (Producer, Offtaker, Capital, Certifier)</w:t>
       </w:r>
-      <w:del w:id="9033" w:author="Claude" w:date="2026-10-21T17:00:00Z">
-        <w:r>
-          <w:delText xml:space="preserve"> and add an OFFTAKER, and offtakers</w:delText>
-        </w:r>
-      </w:del>
-      <w:ins w:id="9034" w:author="Claude" w:date="2026-10-21T17:00:00Z">
-        <w:r>
-          <w:t>, and offtakers</w:t>
-        </w:r>
-      </w:ins>
+      <w:r>
+        <w:t>, and offtakers</w:t>
+      </w:r>
       <w:r>
         <w:t xml:space="preserve"> have their own gate view. Lenses are views over one evidence base, not separate scores. [GEX]</w:t>
       </w:r>
@@ -5647,29 +5445,15 @@
         </w:numPr>
         <w:spacing w:after="70"/>
       </w:pPr>
-      <w:del w:id="9037" w:author="Claude" w:date="2026-10-21T17:00:00Z">
-        <w:r>
-          <w:delText xml:space="preserve">Compute tenTen</w:delText>
-        </w:r>
-      </w:del>
-      <w:ins w:id="9038" w:author="Claude" w:date="2026-10-21T17:00:00Z">
-        <w:r>
-          <w:t>Ten</w:t>
-        </w:r>
-      </w:ins>
+      <w:r>
+        <w:t>Ten</w:t>
+      </w:r>
       <w:r>
         <w:t xml:space="preserve"> commitment coherence checks </w:t>
       </w:r>
-      <w:del w:id="9035" w:author="Claude" w:date="2026-10-21T17:00:00Z">
-        <w:r>
-          <w:delText>across contractsare</w:delText>
-        </w:r>
-      </w:del>
-      <w:ins w:id="9036" w:author="Claude" w:date="2026-10-21T17:00:00Z">
-        <w:r>
-          <w:t>are</w:t>
-        </w:r>
-      </w:ins>
+      <w:r>
+        <w:t>are</w:t>
+      </w:r>
       <w:r>
         <w:t xml:space="preserve"> computed across the commitment cards, and a failed check blocks its gate. This is GEX's first real convergence test; it compares what the cards record, not the documents themselves. [GEX]</w:t>
       </w:r>
@@ -5683,42 +5467,21 @@
         </w:numPr>
         <w:spacing w:after="70"/>
       </w:pPr>
-      <w:del w:id="9043" w:author="Claude" w:date="2026-10-21T17:00:00Z">
-        <w:r>
-          <w:delText xml:space="preserve">Keep gatesGates</w:delText>
-        </w:r>
-      </w:del>
-      <w:ins w:id="9044" w:author="Claude" w:date="2026-10-21T17:00:00Z">
-        <w:r>
-          <w:t>Gates</w:t>
-        </w:r>
-      </w:ins>
+      <w:r>
+        <w:t>Gates</w:t>
+      </w:r>
       <w:r>
         <w:t xml:space="preserve"> stay live after FID: </w:t>
       </w:r>
-      <w:del w:id="9041" w:author="Claude" w:date="2026-10-21T17:00:00Z">
-        <w:r>
-          <w:delText xml:space="preserve">regress on longstop breach, policy revocation, supplier or contractor insolvencythree</w:delText>
-        </w:r>
-      </w:del>
-      <w:ins w:id="9042" w:author="Claude" w:date="2026-10-21T17:00:00Z">
-        <w:r>
-          <w:t>three</w:t>
-        </w:r>
-      </w:ins>
+      <w:r>
+        <w:t>three</w:t>
+      </w:r>
       <w:r>
         <w:t xml:space="preserve"> triggers (power contract or public support revoked, certification </w:t>
       </w:r>
-      <w:del w:id="9039" w:author="Claude" w:date="2026-10-21T17:00:00Z">
-        <w:r>
-          <w:delText>suspensionsuspended</w:delText>
-        </w:r>
-      </w:del>
-      <w:ins w:id="9040" w:author="Claude" w:date="2026-10-21T17:00:00Z">
-        <w:r>
-          <w:t>suspended</w:t>
-        </w:r>
-      </w:ins>
+      <w:r>
+        <w:t>suspended</w:t>
+      </w:r>
       <w:r>
         <w:t>, EPC contractor or key OEM insolvent) block the gates they undermine, and a schedule forecast past the offtake longstop fails check C5 while the offtake is still conditional. [GEX]</w:t>
       </w:r>
@@ -5744,25 +5507,21 @@
           <w:numId w:val="3"/>
         </w:numPr>
         <w:spacing w:after="70"/>
+        <w:rPr/>
+      </w:pPr>
+      <w:r>
+        <w:t xml:space="preserve">Verification (1, 2 and 21 October 2026; platform, not rules): an adversarial test showed a producer could verify its own evidence. Since then only a reviewer assigned to the gate verifies, never the submitter, its company or the owner, and the verification names the document. Who reviews which gate is in the front section. </w:t>
+      </w:r>
+      <w:r>
         <w:rPr>
-          <w:ins w:id="9045" w:author="Claude" w:date="2026-10-21T17:00:00Z"/>
+          <w:b/>
+          <w:bCs/>
+          <w:color w:val="3A4A46"/>
+          <w:sz w:val="18"/>
+          <w:szCs w:val="18"/>
         </w:rPr>
-      </w:pPr>
-      <w:ins w:id="9046" w:author="Claude" w:date="2026-10-21T17:00:00Z">
-        <w:r>
-          <w:t xml:space="preserve">Verification (1, 2 and 21 October 2026; platform, not rules): an adversarial test showed a producer could verify its own evidence. Since then only a reviewer assigned to the gate verifies, never the submitter, its company or the owner, and the verification names the document. Who reviews which gate is in the front section. </w:t>
-        </w:r>
-        <w:r>
-          <w:rPr>
-            <w:b/>
-            <w:bCs/>
-            <w:color w:val="3A4A46"/>
-            <w:sz w:val="18"/>
-            <w:szCs w:val="18"/>
-          </w:rPr>
-          <w:t>[GEX]</w:t>
-        </w:r>
-      </w:ins>
+        <w:t>[GEX]</w:t>
+      </w:r>
     </w:p>
     <w:p>
       <w:pPr>
@@ -5786,29 +5545,25 @@
           <w:numId w:val="2"/>
         </w:numPr>
         <w:spacing w:after="80"/>
+        <w:rPr/>
+      </w:pPr>
+      <w:r>
         <w:rPr>
-          <w:ins w:id="9047" w:author="Claude" w:date="2026-10-21T17:00:00Z"/>
+          <w:b/>
+          <w:bCs/>
         </w:rPr>
-      </w:pPr>
-      <w:ins w:id="9048" w:author="Claude" w:date="2026-10-21T17:00:00Z">
-        <w:r>
-          <w:rPr>
-            <w:b/>
-            <w:bCs/>
-          </w:rPr>
-          <w:t xml:space="preserve">Each table is the challenge of 27 September 2026: “Current lens” and “Missing” describe the engine then, “Proposed” what the challenge asked for. What was built is in sections 8.2 and 8.3. The line under each gate name is its status today. </w:t>
-        </w:r>
-        <w:r>
-          <w:rPr>
-            <w:b/>
-            <w:bCs/>
-            <w:color w:val="3A4A46"/>
-            <w:sz w:val="18"/>
-            <w:szCs w:val="18"/>
-          </w:rPr>
-          <w:t>[GEX]</w:t>
-        </w:r>
-      </w:ins>
+        <w:t xml:space="preserve">Each table is the challenge of 27 September 2026: “Current lens” and “Missing” describe the engine then, “Proposed” what the challenge asked for. What was built is in sections 8.2 and 8.3. The line under each gate name is its status today. </w:t>
+      </w:r>
+      <w:r>
+        <w:rPr>
+          <w:b/>
+          <w:bCs/>
+          <w:color w:val="3A4A46"/>
+          <w:sz w:val="18"/>
+          <w:szCs w:val="18"/>
+        </w:rPr>
+        <w:t>[GEX]</w:t>
+      </w:r>
     </w:p>
     <w:p>
       <w:pPr>
@@ -7695,26 +7450,14 @@
         </w:rPr>
         <w:t xml:space="preserve">achievement · project equity · </w:t>
       </w:r>
-      <w:del w:id="9049" w:author="Claude" w:date="2026-10-21T17:00:00Z">
-        <w:r>
-          <w:rPr>
-            <w:color w:val="6A7A76"/>
-            <w:sz w:val="18"/>
-            <w:szCs w:val="18"/>
-          </w:rPr>
-          <w:delText>waived for balance-sheet projects</w:delText>
-        </w:r>
-      </w:del>
-      <w:ins w:id="9050" w:author="Claude" w:date="2026-10-21T17:00:00Z">
-        <w:r>
-          <w:rPr>
-            <w:color w:val="6A7A76"/>
-            <w:sz w:val="18"/>
-            <w:szCs w:val="18"/>
-          </w:rPr>
-          <w:t>applies to every project since rules 4.0.0</w:t>
-        </w:r>
-      </w:ins>
+      <w:r>
+        <w:rPr>
+          <w:color w:val="6A7A76"/>
+          <w:sz w:val="18"/>
+          <w:szCs w:val="18"/>
+        </w:rPr>
+        <w:t>applies to every project since rules 4.0.0</w:t>
+      </w:r>
     </w:p>
     <w:tbl>
       <w:tblPr>
@@ -9159,26 +8902,14 @@
         </w:rPr>
         <w:t xml:space="preserve">readiness · no capital · </w:t>
       </w:r>
-      <w:del w:id="9051" w:author="Claude" w:date="2026-10-21T17:00:00Z">
-        <w:r>
-          <w:rPr>
-            <w:color w:val="6A7A76"/>
-            <w:sz w:val="18"/>
-            <w:szCs w:val="18"/>
-          </w:rPr>
-          <w:delText>waived for balance-sheet projects</w:delText>
-        </w:r>
-      </w:del>
-      <w:ins w:id="9052" w:author="Claude" w:date="2026-10-21T17:00:00Z">
-        <w:r>
-          <w:rPr>
-            <w:color w:val="6A7A76"/>
-            <w:sz w:val="18"/>
-            <w:szCs w:val="18"/>
-          </w:rPr>
-          <w:t>applies to every project since rules 4.0.0</w:t>
-        </w:r>
-      </w:ins>
+      <w:r>
+        <w:rPr>
+          <w:color w:val="6A7A76"/>
+          <w:sz w:val="18"/>
+          <w:szCs w:val="18"/>
+        </w:rPr>
+        <w:t>applies to every project since rules 4.0.0</w:t>
+      </w:r>
     </w:p>
     <w:tbl>
       <w:tblPr>
@@ -9639,26 +9370,14 @@
         </w:rPr>
         <w:t xml:space="preserve">achievement · </w:t>
       </w:r>
-      <w:del w:id="9055" w:author="Claude" w:date="2026-10-21T17:00:00Z">
-        <w:r>
-          <w:rPr>
-            <w:color w:val="6A7A76"/>
-            <w:sz w:val="18"/>
-            <w:szCs w:val="18"/>
-          </w:rPr>
-          <w:delText>senior debt commitment</w:delText>
-        </w:r>
-      </w:del>
-      <w:ins w:id="9056" w:author="Claude" w:date="2026-10-21T17:00:00Z">
-        <w:r>
-          <w:rPr>
-            <w:color w:val="6A7A76"/>
-            <w:sz w:val="18"/>
-            <w:szCs w:val="18"/>
-          </w:rPr>
-          <w:t>Senior Debt Credit Approval (conditional)</w:t>
-        </w:r>
-      </w:ins>
+      <w:r>
+        <w:rPr>
+          <w:color w:val="6A7A76"/>
+          <w:sz w:val="18"/>
+          <w:szCs w:val="18"/>
+        </w:rPr>
+        <w:t>Senior Debt Credit Approval (conditional)</w:t>
+      </w:r>
       <w:r>
         <w:rPr>
           <w:color w:val="6A7A76"/>
@@ -10453,26 +10172,14 @@
         </w:rPr>
         <w:t xml:space="preserve">achievement · debt drawdown · </w:t>
       </w:r>
-      <w:del w:id="9053" w:author="Claude" w:date="2026-10-21T17:00:00Z">
-        <w:r>
-          <w:rPr>
-            <w:color w:val="6A7A76"/>
-            <w:sz w:val="18"/>
-            <w:szCs w:val="18"/>
-          </w:rPr>
-          <w:delText>waived for balance-sheet projects</w:delText>
-        </w:r>
-      </w:del>
-      <w:ins w:id="9054" w:author="Claude" w:date="2026-10-21T17:00:00Z">
-        <w:r>
-          <w:rPr>
-            <w:color w:val="6A7A76"/>
-            <w:sz w:val="18"/>
-            <w:szCs w:val="18"/>
-          </w:rPr>
-          <w:t>applies to every project; its lender items under project finance only</w:t>
-        </w:r>
-      </w:ins>
+      <w:r>
+        <w:rPr>
+          <w:color w:val="6A7A76"/>
+          <w:sz w:val="18"/>
+          <w:szCs w:val="18"/>
+        </w:rPr>
+        <w:t>applies to every project; its lender items under project finance only</w:t>
+      </w:r>
     </w:p>
     <w:tbl>
       <w:tblPr>
@@ -11241,40 +10948,16 @@
       <w:r>
         <w:t xml:space="preserve">Nine criteria that sit alongside the financing criteria. The last two columns state what must be true before the producer can responsibly sign a binding-with-conditions offtake, and what before it gives unconditional commitments. The thresholds are GEX’s proposal, anchored in the practice cited. [I] Since rules 4.0.0 most criteria have evidence items in the gates (technology, licensor, FEED, EPC, inputs, permits, product qualification and certificates, O&amp;M), and row 9 is computed by the coherence checks (section 8.4). </w:t>
       </w:r>
-      <w:del w:id="9057" w:author="Claude" w:date="2026-10-21T17:00:00Z">
-        <w:r>
-          <w:rPr>
-            <w:b/>
-            <w:bCs/>
-          </w:rPr>
-          <w:delText>[GEX].</w:delText>
-        </w:r>
-        <w:r>
-          <w:delText xml:space="preserve"> </w:delText>
-        </w:r>
-        <w:r>
-          <w:rPr>
-            <w:b/>
-            <w:bCs/>
-            <w:color w:val="A8341A"/>
-            <w:sz w:val="18"/>
-            <w:szCs w:val="18"/>
-          </w:rPr>
-          <w:delText>[I]</w:delText>
-        </w:r>
-      </w:del>
-      <w:ins w:id="9058" w:author="Claude" w:date="2026-10-21T17:00:00Z">
-        <w:r>
-          <w:rPr>
-            <w:b/>
-            <w:bCs/>
-            <w:color w:val="3A4A46"/>
-            <w:sz w:val="18"/>
-            <w:szCs w:val="18"/>
-          </w:rPr>
-          <w:t>[GEX]</w:t>
-        </w:r>
-      </w:ins>
+      <w:r>
+        <w:rPr>
+          <w:b/>
+          <w:bCs/>
+          <w:color w:val="3A4A46"/>
+          <w:sz w:val="18"/>
+          <w:szCs w:val="18"/>
+        </w:rPr>
+        <w:t>[GEX]</w:t>
+      </w:r>
     </w:p>
     <w:tbl>
       <w:tblPr>
@@ -13734,15 +13417,13 @@
               </w:rPr>
               <w:t xml:space="preserve">Contracted Volume within guaranteed capacity</w:t>
             </w:r>
-            <w:ins w:id="25" w:author="Claude" w:date="2026-09-30T09:00:00Z">
-              <w:r>
-                <w:rPr>
-                  <w:sz w:val="16"/>
-                  <w:szCs w:val="16"/>
-                </w:rPr>
-                <w:t>; a</w:t>
-              </w:r>
-            </w:ins>
+            <w:r>
+              <w:rPr>
+                <w:sz w:val="16"/>
+                <w:szCs w:val="16"/>
+              </w:rPr>
+              <w:t>; a</w:t>
+            </w:r>
             <w:r>
               <w:rPr>
                 <w:sz w:val="16"/>
@@ -15234,65 +14915,25 @@
             <w:pPr>
               <w:spacing w:after="40"/>
             </w:pPr>
-            <w:del w:id="9059" w:author="Claude" w:date="2026-10-21T17:00:00Z">
-              <w:r>
-                <w:rPr>
-                  <w:sz w:val="15"/>
-                  <w:szCs w:val="15"/>
-                </w:rPr>
-                <w:delText xml:space="preserve">Termsheet heads of agreement agreed form</w:delText>
-              </w:r>
-            </w:del>
-            <w:ins w:id="9060" w:author="Claude" w:date="2026-10-21T17:00:00Z">
-              <w:r>
-                <w:rPr>
-                  <w:sz w:val="15"/>
-                  <w:szCs w:val="15"/>
-                </w:rPr>
-                <w:t>Heads of agreement or term sheet</w:t>
-              </w:r>
-            </w:ins>
             <w:r>
               <w:rPr>
                 <w:sz w:val="15"/>
                 <w:szCs w:val="15"/>
               </w:rPr>
-              <w:t>: a commercial fit, not binding</w:t>
-            </w:r>
-          </w:p>
-        </w:tc>
-        <w:tc>
-          <w:tcPr>
-            <w:tcW w:w="1900" w:type="dxa"/>
-            <w:tcBorders>
-              <w:top w:val="single" w:sz="4" w:space="0" w:color="D6DFDB"/>
-              <w:left w:val="single" w:sz="4" w:space="0" w:color="D6DFDB"/>
-              <w:bottom w:val="single" w:sz="4" w:space="0" w:color="D6DFDB"/>
-              <w:right w:val="single" w:sz="4" w:space="0" w:color="D6DFDB"/>
-            </w:tcBorders>
-            <w:tcMar>
-              <w:top w:w="70" w:type="dxa"/>
-              <w:left w:w="100" w:type="dxa"/>
-              <w:bottom w:w="70" w:type="dxa"/>
-              <w:right w:w="100" w:type="dxa"/>
-            </w:tcMar>
-          </w:tcPr>
-          <w:p>
-            <w:pPr>
-              <w:spacing w:after="40"/>
-            </w:pPr>
+              <w:t>Heads of agreement or term sheet</w:t>
+            </w:r>
             <w:r>
               <w:rPr>
                 <w:sz w:val="15"/>
                 <w:szCs w:val="15"/>
               </w:rPr>
-              <w:t>Key terms agreed but not binding</w:t>
-            </w:r>
-          </w:p>
-        </w:tc>
-        <w:tc>
-          <w:tcPr>
-            <w:tcW w:w="2560" w:type="dxa"/>
+              <w:t>: a commercial fit, not binding</w:t>
+            </w:r>
+          </w:p>
+        </w:tc>
+        <w:tc>
+          <w:tcPr>
+            <w:tcW w:w="1900" w:type="dxa"/>
             <w:tcBorders>
               <w:top w:val="single" w:sz="4" w:space="0" w:color="D6DFDB"/>
               <w:left w:val="single" w:sz="4" w:space="0" w:color="D6DFDB"/>
@@ -15315,36 +14956,44 @@
                 <w:sz w:val="15"/>
                 <w:szCs w:val="15"/>
               </w:rPr>
+              <w:t>Key terms agreed but not binding</w:t>
+            </w:r>
+          </w:p>
+        </w:tc>
+        <w:tc>
+          <w:tcPr>
+            <w:tcW w:w="2560" w:type="dxa"/>
+            <w:tcBorders>
+              <w:top w:val="single" w:sz="4" w:space="0" w:color="D6DFDB"/>
+              <w:left w:val="single" w:sz="4" w:space="0" w:color="D6DFDB"/>
+              <w:bottom w:val="single" w:sz="4" w:space="0" w:color="D6DFDB"/>
+              <w:right w:val="single" w:sz="4" w:space="0" w:color="D6DFDB"/>
+            </w:tcBorders>
+            <w:tcMar>
+              <w:top w:w="70" w:type="dxa"/>
+              <w:left w:w="100" w:type="dxa"/>
+              <w:bottom w:w="70" w:type="dxa"/>
+              <w:right w:w="100" w:type="dxa"/>
+            </w:tcMar>
+          </w:tcPr>
+          <w:p>
+            <w:pPr>
+              <w:spacing w:after="40"/>
+            </w:pPr>
+            <w:r>
+              <w:rPr>
+                <w:sz w:val="15"/>
+                <w:szCs w:val="15"/>
+              </w:rPr>
               <w:t xml:space="preserve">Commercial fit on volume, price formula, tenor, delivery. Producer at feasibility or </w:t>
             </w:r>
-            <w:del w:id="9061" w:author="Claude" w:date="2026-10-21T17:00:00Z">
-              <w:r>
-                <w:rPr>
-                  <w:sz w:val="15"/>
-                  <w:szCs w:val="15"/>
-                </w:rPr>
-                <w:delText>FEED</w:delText>
-              </w:r>
-              <w:r>
-                <w:delText xml:space="preserve"> </w:delText>
-              </w:r>
-              <w:r>
-                <w:rPr>
-                  <w:sz w:val="15"/>
-                  <w:szCs w:val="15"/>
-                </w:rPr>
-                <w:delText>needed for at least</w:delText>
-              </w:r>
-            </w:del>
-            <w:ins w:id="9062" w:author="Claude" w:date="2026-10-21T17:00:00Z">
-              <w:r>
-                <w:rPr>
-                  <w:sz w:val="15"/>
-                  <w:szCs w:val="15"/>
-                </w:rPr>
-                <w:t>FEED. Needed for at least</w:t>
-              </w:r>
-            </w:ins>
+            <w:r>
+              <w:rPr>
+                <w:sz w:val="15"/>
+                <w:szCs w:val="15"/>
+              </w:rPr>
+              <w:t>FEED. Needed for at least</w:t>
+            </w:r>
             <w:r>
               <w:rPr>
                 <w:sz w:val="15"/>
@@ -15740,24 +15389,13 @@
               </w:rPr>
               <w:t xml:space="preserve">The buyer has done its diligence and will be bound if the project matures. Value depends on the conditions and on how realistic the longstop is. </w:t>
             </w:r>
-            <w:del w:id="9063" w:author="Claude" w:date="2026-10-21T17:00:00Z">
-              <w:r>
-                <w:rPr>
-                  <w:sz w:val="15"/>
-                  <w:szCs w:val="15"/>
-                </w:rPr>
-                <w:delText>G4 requires O4</w:delText>
-              </w:r>
-            </w:del>
-            <w:ins w:id="9064" w:author="Claude" w:date="2026-10-21T17:00:00Z">
-              <w:r>
-                <w:rPr>
-                  <w:sz w:val="15"/>
-                  <w:szCs w:val="15"/>
-                </w:rPr>
-                <w:t>G4 requires O4.</w:t>
-              </w:r>
-            </w:ins>
+            <w:r>
+              <w:rPr>
+                <w:sz w:val="15"/>
+                <w:szCs w:val="15"/>
+              </w:rPr>
+              <w:t>G4 requires O4.</w:t>
+            </w:r>
           </w:p>
         </w:tc>
         <w:tc>
@@ -16403,11 +16041,6 @@
           <w:sz w:val="21"/>
           <w:szCs w:val="21"/>
         </w:rPr>
-        <w:pPrChange w:id="9202" w:author="Claude" w:date="2026-10-21T17:00:00Z">
-          <w:pPr>
-            <w:pStyle w:val="Heading2"/>
-          </w:pPr>
-        </w:pPrChange>
       </w:pPr>
       <w:bookmarkStart w:id="28" w:name="_Toc241505201"/>
       <w:r>
@@ -16452,11 +16085,6 @@
           <w:sz w:val="21"/>
           <w:szCs w:val="21"/>
         </w:rPr>
-        <w:pPrChange w:id="9203" w:author="Claude" w:date="2026-10-21T17:00:00Z">
-          <w:pPr>
-            <w:pStyle w:val="Heading2"/>
-          </w:pPr>
-        </w:pPrChange>
       </w:pPr>
       <w:r>
         <w:rPr>
@@ -16480,11 +16108,6 @@
           <w:sz w:val="21"/>
           <w:szCs w:val="21"/>
         </w:rPr>
-        <w:pPrChange w:id="9204" w:author="Claude" w:date="2026-10-21T17:00:00Z">
-          <w:pPr>
-            <w:pStyle w:val="Heading2"/>
-          </w:pPr>
-        </w:pPrChange>
       </w:pPr>
       <w:r>
         <w:rPr>
@@ -16508,11 +16131,6 @@
           <w:sz w:val="21"/>
           <w:szCs w:val="21"/>
         </w:rPr>
-        <w:pPrChange w:id="9205" w:author="Claude" w:date="2026-10-21T17:00:00Z">
-          <w:pPr>
-            <w:pStyle w:val="Heading2"/>
-          </w:pPr>
-        </w:pPrChange>
       </w:pPr>
       <w:r>
         <w:rPr>
@@ -18417,39 +18035,25 @@
         <w:lastRenderedPageBreak/>
         <w:t xml:space="preserve">In GEX: </w:t>
       </w:r>
-      <w:del w:id="9065" w:author="Claude" w:date="2026-10-21T17:00:00Z">
-        <w:r>
-          <w:delText>the offtaker accounts</w:delText>
-        </w:r>
-      </w:del>
-      <w:ins w:id="9066" w:author="Claude" w:date="2026-10-21T17:00:00Z">
-        <w:r>
-          <w:t>offtaker accounts</w:t>
-        </w:r>
-      </w:ins>
+      <w:r>
+        <w:t>offtaker accounts</w:t>
+      </w:r>
       <w:r>
         <w:t xml:space="preserve"> have their own gate view (G2, G4, G5, G9, G10, G11) and an Offtaker lens on every item. The offtaker’s own </w:t>
       </w:r>
-      <w:del w:id="9067" w:author="Claude" w:date="2026-10-21T17:00:00Z">
-        <w:r>
-          <w:delText>readiness (section 4.3), and let them see the O-level the project can support at each state. is not yet recorded. [GEX].</w:delText>
-        </w:r>
-      </w:del>
-      <w:ins w:id="9068" w:author="Claude" w:date="2026-10-21T17:00:00Z">
-        <w:r>
-          <w:t xml:space="preserve">readiness (section 4.3) is not yet recorded. </w:t>
-        </w:r>
-        <w:r>
-          <w:rPr>
-            <w:b/>
-            <w:bCs/>
-            <w:color w:val="3A4A46"/>
-            <w:sz w:val="18"/>
-            <w:szCs w:val="18"/>
-          </w:rPr>
-          <w:t>[GEX]</w:t>
-        </w:r>
-      </w:ins>
+      <w:r>
+        <w:t xml:space="preserve">readiness (section 4.3) is not yet recorded. </w:t>
+      </w:r>
+      <w:r>
+        <w:rPr>
+          <w:b/>
+          <w:bCs/>
+          <w:color w:val="3A4A46"/>
+          <w:sz w:val="18"/>
+          <w:szCs w:val="18"/>
+        </w:rPr>
+        <w:t>[GEX]</w:t>
+      </w:r>
     </w:p>
     <w:p>
       <w:pPr>
@@ -18760,24 +18364,13 @@
             <w:pPr>
               <w:spacing w:after="40"/>
             </w:pPr>
-            <w:del w:id="9069" w:author="Claude" w:date="2026-10-21T17:00:00Z">
-              <w:r>
-                <w:rPr>
-                  <w:sz w:val="16"/>
-                  <w:szCs w:val="16"/>
-                </w:rPr>
-                <w:delText>—No</w:delText>
-              </w:r>
-            </w:del>
-            <w:ins w:id="9070" w:author="Claude" w:date="2026-10-21T17:00:00Z">
-              <w:r>
-                <w:rPr>
-                  <w:sz w:val="16"/>
-                  <w:szCs w:val="16"/>
-                </w:rPr>
-                <w:t>No</w:t>
-              </w:r>
-            </w:ins>
+            <w:r>
+              <w:rPr>
+                <w:sz w:val="16"/>
+                <w:szCs w:val="16"/>
+              </w:rPr>
+              <w:t>No</w:t>
+            </w:r>
             <w:r>
               <w:rPr>
                 <w:sz w:val="16"/>
@@ -18928,49 +18521,27 @@
             <w:pPr>
               <w:spacing w:after="40"/>
             </w:pPr>
-            <w:del w:id="9071" w:author="Claude" w:date="2026-10-21T17:00:00Z">
-              <w:r>
-                <w:rPr>
-                  <w:sz w:val="16"/>
-                  <w:szCs w:val="16"/>
-                </w:rPr>
-                <w:delText>contracting model chosen</w:delText>
-              </w:r>
-            </w:del>
-            <w:ins w:id="9072" w:author="Claude" w:date="2026-10-21T17:00:00Z">
-              <w:r>
-                <w:rPr>
-                  <w:sz w:val="16"/>
-                  <w:szCs w:val="16"/>
-                </w:rPr>
-                <w:t>Contracting model chosen</w:t>
-              </w:r>
-            </w:ins>
             <w:r>
               <w:rPr>
                 <w:sz w:val="16"/>
                 <w:szCs w:val="16"/>
               </w:rPr>
+              <w:t>Contracting model chosen</w:t>
+            </w:r>
+            <w:r>
+              <w:rPr>
+                <w:sz w:val="16"/>
+                <w:szCs w:val="16"/>
+              </w:rPr>
               <w:t xml:space="preserve">, contractor candidates identified. </w:t>
             </w:r>
-            <w:del w:id="9073" w:author="Claude" w:date="2026-10-21T17:00:00Z">
-              <w:r>
-                <w:rPr>
-                  <w:sz w:val="16"/>
-                  <w:szCs w:val="16"/>
-                </w:rPr>
-                <w:delText>In practice also: lump-sum turnkey</w:delText>
-              </w:r>
-            </w:del>
-            <w:ins w:id="9074" w:author="Claude" w:date="2026-10-21T17:00:00Z">
-              <w:r>
-                <w:rPr>
-                  <w:sz w:val="16"/>
-                  <w:szCs w:val="16"/>
-                </w:rPr>
-                <w:t>In practice also: the model (lump-sum turnkey</w:t>
-              </w:r>
-            </w:ins>
+            <w:r>
+              <w:rPr>
+                <w:sz w:val="16"/>
+                <w:szCs w:val="16"/>
+              </w:rPr>
+              <w:t>In practice also: the model (lump-sum turnkey</w:t>
+            </w:r>
             <w:r>
               <w:rPr>
                 <w:sz w:val="16"/>
@@ -19749,49 +19320,27 @@
               </w:rPr>
               <w:t xml:space="preserve">Effective and bankable: notice to proceed issued; </w:t>
             </w:r>
-            <w:del w:id="9075" w:author="Claude" w:date="2026-10-21T17:00:00Z">
-              <w:r>
-                <w:rPr>
-                  <w:sz w:val="16"/>
-                  <w:szCs w:val="16"/>
-                </w:rPr>
-                <w:delText>Security posted In practice also: interfaces wrapped,  performance</w:delText>
-              </w:r>
-            </w:del>
-            <w:ins w:id="9076" w:author="Claude" w:date="2026-10-21T17:00:00Z">
-              <w:r>
-                <w:rPr>
-                  <w:sz w:val="16"/>
-                  <w:szCs w:val="16"/>
-                </w:rPr>
-                <w:t>security posted. In practice also: interfaces wrapped, performance</w:t>
-              </w:r>
-            </w:ins>
             <w:r>
               <w:rPr>
                 <w:sz w:val="16"/>
                 <w:szCs w:val="16"/>
               </w:rPr>
+              <w:t>security posted. In practice also: interfaces wrapped, performance</w:t>
+            </w:r>
+            <w:r>
+              <w:rPr>
+                <w:sz w:val="16"/>
+                <w:szCs w:val="16"/>
+              </w:rPr>
               <w:t xml:space="preserve"> bond or parent guarantee and retention posted, construction insurance in place, which GEX requires bound </w:t>
             </w:r>
-            <w:del w:id="9077" w:author="Claude" w:date="2026-10-21T17:00:00Z">
-              <w:r>
-                <w:rPr>
-                  <w:sz w:val="16"/>
-                  <w:szCs w:val="16"/>
-                </w:rPr>
-                <w:delText>at G10..</w:delText>
-              </w:r>
-            </w:del>
-            <w:ins w:id="9078" w:author="Claude" w:date="2026-10-21T17:00:00Z">
-              <w:r>
-                <w:rPr>
-                  <w:sz w:val="16"/>
-                  <w:szCs w:val="16"/>
-                </w:rPr>
-                <w:t>at G10.</w:t>
-              </w:r>
-            </w:ins>
+            <w:r>
+              <w:rPr>
+                <w:sz w:val="16"/>
+                <w:szCs w:val="16"/>
+              </w:rPr>
+              <w:t>at G10.</w:t>
+            </w:r>
           </w:p>
         </w:tc>
         <w:tc>
@@ -20750,34 +20299,13 @@
               </w:rPr>
               <w:t xml:space="preserve">The technology’s commercial readiness caps the capital available, whatever the project evidence says. HEFA (a mature pathway) closed non-recourse project finance for DSL-01 in February 2026; first-of-a-kind e-SAF has so far reached FID on equity-led structures, with project debt arriving behind strong sponsors or in modest amounts (Infinium: Brookfield and Breakthrough Energy Catalyst equity plus an HSBC project credit of undisclosed size, HSBC as sole lender; Twelve: US$600m of project and corporate equity plus </w:t>
             </w:r>
-            <w:del w:id="9079" w:author="Claude" w:date="2026-10-21T17:00:00Z">
-              <w:r>
-                <w:rPr>
-                  <w:sz w:val="19"/>
-                  <w:szCs w:val="19"/>
-                </w:rPr>
-                <w:delText>US$45m of credit facilities</w:delText>
-              </w:r>
-              <w:r>
-                <w:delText xml:space="preserve"> </w:delText>
-              </w:r>
-              <w:r>
-                <w:rPr>
-                  <w:sz w:val="19"/>
-                  <w:szCs w:val="19"/>
-                </w:rPr>
-                <w:delText xml:space="preserve">A ladder</w:delText>
-              </w:r>
-            </w:del>
-            <w:ins w:id="9080" w:author="Claude" w:date="2026-10-21T17:00:00Z">
-              <w:r>
-                <w:rPr>
-                  <w:sz w:val="19"/>
-                  <w:szCs w:val="19"/>
-                </w:rPr>
-                <w:t>US$45m of credit facilities). A ladder</w:t>
-              </w:r>
-            </w:ins>
+            <w:r>
+              <w:rPr>
+                <w:sz w:val="19"/>
+                <w:szCs w:val="19"/>
+              </w:rPr>
+              <w:t>US$45m of credit facilities). A ladder</w:t>
+            </w:r>
             <w:r>
               <w:rPr>
                 <w:sz w:val="19"/>
@@ -21589,24 +21117,13 @@
             <w:pPr>
               <w:spacing w:after="40"/>
             </w:pPr>
-            <w:del w:id="9081" w:author="Claude" w:date="2026-10-21T17:00:00Z">
-              <w:r>
-                <w:rPr>
-                  <w:sz w:val="15"/>
-                  <w:szCs w:val="15"/>
-                </w:rPr>
-                <w:delText xml:space="preserve">O2 O2</w:delText>
-              </w:r>
-            </w:del>
-            <w:ins w:id="9082" w:author="Claude" w:date="2026-10-21T17:00:00Z">
-              <w:r>
-                <w:rPr>
-                  <w:sz w:val="15"/>
-                  <w:szCs w:val="15"/>
-                </w:rPr>
-                <w:t>O2</w:t>
-              </w:r>
-            </w:ins>
+            <w:r>
+              <w:rPr>
+                <w:sz w:val="15"/>
+                <w:szCs w:val="15"/>
+              </w:rPr>
+              <w:t>O2</w:t>
+            </w:r>
             <w:r>
               <w:rPr>
                 <w:sz w:val="15"/>
@@ -22143,24 +21660,13 @@
               </w:rPr>
               <w:t xml:space="preserve">Credit approval conditional until financial close (PF), or board </w:t>
             </w:r>
-            <w:del w:id="9083" w:author="Claude" w:date="2026-10-21T17:00:00Z">
-              <w:r>
-                <w:rPr>
-                  <w:sz w:val="15"/>
-                  <w:szCs w:val="15"/>
-                </w:rPr>
-                <w:delText>approval;development</w:delText>
-              </w:r>
-            </w:del>
-            <w:ins w:id="9084" w:author="Claude" w:date="2026-10-21T17:00:00Z">
-              <w:r>
-                <w:rPr>
-                  <w:sz w:val="15"/>
-                  <w:szCs w:val="15"/>
-                </w:rPr>
-                <w:t>approval; development</w:t>
-              </w:r>
-            </w:ins>
+            <w:r>
+              <w:rPr>
+                <w:sz w:val="15"/>
+                <w:szCs w:val="15"/>
+              </w:rPr>
+              <w:t>approval; development</w:t>
+            </w:r>
             <w:r>
               <w:rPr>
                 <w:sz w:val="15"/>
@@ -26219,51 +25725,40 @@
               </w:rPr>
               <w:t xml:space="preserve">Seven of fifteen winners withdrew (1.88 GW of 2.33 GW); some could not sign the completion guarantee; permitting and infrastructure delays. In the first round, some winners returned awards because the premium did not attract offtakers. By 20 January 2026, six projects had signed grant agreements, for </w:t>
             </w:r>
-            <w:del w:id="9085" w:author="Claude" w:date="2026-10-21T17:00:00Z">
-              <w:r>
-                <w:rPr>
-                  <w:sz w:val="15"/>
-                  <w:szCs w:val="15"/>
-                </w:rPr>
-                <w:delText>€270.6m&lt;- but many turned out to be a nightmare</w:delText>
-              </w:r>
-            </w:del>
-            <w:ins w:id="9086" w:author="Claude" w:date="2026-10-21T17:00:00Z">
-              <w:r>
-                <w:rPr>
-                  <w:sz w:val="15"/>
-                  <w:szCs w:val="15"/>
-                </w:rPr>
-                <w:t>€270.6m</w:t>
-              </w:r>
-            </w:ins>
-          </w:p>
-        </w:tc>
-        <w:tc>
-          <w:tcPr>
-            <w:tcW w:w="4000" w:type="dxa"/>
-            <w:tcBorders>
-              <w:top w:val="single" w:sz="4" w:space="0" w:color="D6DFDB"/>
-              <w:left w:val="single" w:sz="4" w:space="0" w:color="D6DFDB"/>
-              <w:bottom w:val="single" w:sz="4" w:space="0" w:color="D6DFDB"/>
-              <w:right w:val="single" w:sz="4" w:space="0" w:color="D6DFDB"/>
-            </w:tcBorders>
-            <w:tcMar>
-              <w:top w:w="70" w:type="dxa"/>
-              <w:left w:w="100" w:type="dxa"/>
-              <w:bottom w:w="70" w:type="dxa"/>
-              <w:right w:w="100" w:type="dxa"/>
-            </w:tcMar>
-          </w:tcPr>
-          <w:p>
-            <w:pPr>
-              <w:spacing w:after="40"/>
-            </w:pPr>
             <w:r>
               <w:rPr>
                 <w:sz w:val="15"/>
                 <w:szCs w:val="15"/>
               </w:rPr>
+              <w:t>€270.6m</w:t>
+            </w:r>
+          </w:p>
+        </w:tc>
+        <w:tc>
+          <w:tcPr>
+            <w:tcW w:w="4000" w:type="dxa"/>
+            <w:tcBorders>
+              <w:top w:val="single" w:sz="4" w:space="0" w:color="D6DFDB"/>
+              <w:left w:val="single" w:sz="4" w:space="0" w:color="D6DFDB"/>
+              <w:bottom w:val="single" w:sz="4" w:space="0" w:color="D6DFDB"/>
+              <w:right w:val="single" w:sz="4" w:space="0" w:color="D6DFDB"/>
+            </w:tcBorders>
+            <w:tcMar>
+              <w:top w:w="70" w:type="dxa"/>
+              <w:left w:w="100" w:type="dxa"/>
+              <w:bottom w:w="70" w:type="dxa"/>
+              <w:right w:w="100" w:type="dxa"/>
+            </w:tcMar>
+          </w:tcPr>
+          <w:p>
+            <w:pPr>
+              <w:spacing w:after="40"/>
+            </w:pPr>
+            <w:r>
+              <w:rPr>
+                <w:sz w:val="15"/>
+                <w:szCs w:val="15"/>
+              </w:rPr>
               <w:t>Price support ahead of producer maturity causes attrition; funders now demand completion guarantees.</w:t>
             </w:r>
           </w:p>
@@ -26288,40 +25783,16 @@
             <w:pPr>
               <w:spacing w:after="40"/>
             </w:pPr>
-            <w:del w:id="9087" w:author="Claude" w:date="2026-10-21T17:00:00Z">
-              <w:r>
-                <w:rPr>
-                  <w:b/>
-                  <w:bCs/>
-                  <w:color w:val="245E42"/>
-                  <w:sz w:val="12"/>
-                  <w:szCs w:val="12"/>
-                </w:rPr>
-                <w:delText>[E]</w:delText>
-              </w:r>
-              <w:r>
-                <w:rPr>
-                  <w:b/>
-                  <w:bCs/>
-                  <w:color w:val="8A5F06"/>
-                  <w:sz w:val="12"/>
-                  <w:szCs w:val="12"/>
-                </w:rPr>
-                <w:delText>[O]</w:delText>
-              </w:r>
-            </w:del>
-            <w:ins w:id="9088" w:author="Claude" w:date="2026-10-21T17:00:00Z">
-              <w:r>
-                <w:rPr>
-                  <w:b/>
-                  <w:bCs/>
-                  <w:color w:val="245E42"/>
-                  <w:sz w:val="18"/>
-                  <w:szCs w:val="18"/>
-                </w:rPr>
-                <w:t>[E]</w:t>
-              </w:r>
-            </w:ins>
+            <w:r>
+              <w:rPr>
+                <w:b/>
+                <w:bCs/>
+                <w:color w:val="245E42"/>
+                <w:sz w:val="18"/>
+                <w:szCs w:val="18"/>
+              </w:rPr>
+              <w:t>[E]</w:t>
+            </w:r>
           </w:p>
         </w:tc>
       </w:tr>
@@ -28098,24 +27569,13 @@
               </w:rPr>
               <w:t xml:space="preserve">G4 offtake, G6 technical review, G7 construction insurance and G10 FID are needed by any producer; </w:t>
             </w:r>
-            <w:del w:id="9089" w:author="Claude" w:date="2026-10-21T17:00:00Z">
-              <w:r>
-                <w:rPr>
-                  <w:sz w:val="16"/>
-                  <w:szCs w:val="16"/>
-                </w:rPr>
-                <w:delText>today all are waived</w:delText>
-              </w:r>
-            </w:del>
-            <w:ins w:id="9090" w:author="Claude" w:date="2026-10-21T17:00:00Z">
-              <w:r>
-                <w:rPr>
-                  <w:sz w:val="16"/>
-                  <w:szCs w:val="16"/>
-                </w:rPr>
-                <w:t>on 27 September all were waived</w:t>
-              </w:r>
-            </w:ins>
+            <w:r>
+              <w:rPr>
+                <w:sz w:val="16"/>
+                <w:szCs w:val="16"/>
+              </w:rPr>
+              <w:t>on 27 September all were waived</w:t>
+            </w:r>
             <w:r>
               <w:rPr>
                 <w:sz w:val="16"/>
@@ -29966,34 +29426,13 @@
               </w:rPr>
               <w:t xml:space="preserve">Plus model-to-contract coherence </w:t>
             </w:r>
-            <w:del w:id="9091" w:author="Claude" w:date="2026-10-21T17:00:00Z">
-              <w:r>
-                <w:rPr>
-                  <w:sz w:val="17"/>
-                  <w:szCs w:val="17"/>
-                </w:rPr>
-                <w:delText>(C10)</w:delText>
-              </w:r>
-              <w:r>
-                <w:delText xml:space="preserve"> </w:delText>
-              </w:r>
-              <w:r>
-                <w:rPr>
-                  <w:sz w:val="17"/>
-                  <w:szCs w:val="17"/>
-                </w:rPr>
-                <w:delText>);</w:delText>
-              </w:r>
-            </w:del>
-            <w:ins w:id="9092" w:author="Claude" w:date="2026-10-21T17:00:00Z">
-              <w:r>
-                <w:rPr>
-                  <w:sz w:val="17"/>
-                  <w:szCs w:val="17"/>
-                </w:rPr>
-                <w:t>(C10);</w:t>
-              </w:r>
-            </w:ins>
+            <w:r>
+              <w:rPr>
+                <w:sz w:val="17"/>
+                <w:szCs w:val="17"/>
+              </w:rPr>
+              <w:t>(C10);</w:t>
+            </w:r>
             <w:r>
               <w:rPr>
                 <w:sz w:val="17"/>
@@ -31005,24 +30444,13 @@
               </w:rPr>
               <w:t xml:space="preserve">Power and CO2 sourcing meet the certification rules </w:t>
             </w:r>
-            <w:del w:id="9093" w:author="Claude" w:date="2026-10-21T17:00:00Z">
-              <w:r>
-                <w:rPr>
-                  <w:sz w:val="16"/>
-                  <w:szCs w:val="16"/>
-                </w:rPr>
-                <w:delText>the offtake requires</w:delText>
-              </w:r>
-            </w:del>
-            <w:ins w:id="9094" w:author="Claude" w:date="2026-10-21T17:00:00Z">
-              <w:r>
-                <w:rPr>
-                  <w:sz w:val="16"/>
-                  <w:szCs w:val="16"/>
-                </w:rPr>
-                <w:t>the offtake requires (G4)</w:t>
-              </w:r>
-            </w:ins>
+            <w:r>
+              <w:rPr>
+                <w:sz w:val="16"/>
+                <w:szCs w:val="16"/>
+              </w:rPr>
+              <w:t>the offtake requires (G4)</w:t>
+            </w:r>
           </w:p>
         </w:tc>
         <w:tc>
@@ -31597,16 +31025,9 @@
       <w:r>
         <w:t xml:space="preserve"> The 13% binding share and the take-or-pay ranges come from hydrogen markets; </w:t>
       </w:r>
-      <w:del w:id="9097" w:author="Claude" w:date="2026-10-21T17:00:00Z">
-        <w:r>
-          <w:delText>I use them</w:delText>
-        </w:r>
-      </w:del>
-      <w:ins w:id="9098" w:author="Claude" w:date="2026-10-21T17:00:00Z">
-        <w:r>
-          <w:t>GEX uses them</w:t>
-        </w:r>
-      </w:ins>
+      <w:r>
+        <w:t>GEX uses them</w:t>
+      </w:r>
       <w:r>
         <w:t xml:space="preserve"> as the closest measured proxies.</w:t>
       </w:r>
@@ -31672,16 +31093,9 @@
       <w:r>
         <w:t xml:space="preserve"> The review changed GEX. Rules 4.0.0 (27-28 September 2026) and 4.1.0 (29 September 2026) implement it, with the deviations </w:t>
       </w:r>
-      <w:del w:id="9095" w:author="Claude" w:date="2026-10-21T17:00:00Z">
-        <w:r>
-          <w:delText>recorded in section 2</w:delText>
-        </w:r>
-      </w:del>
-      <w:ins w:id="9096" w:author="Claude" w:date="2026-10-21T17:00:00Z">
-        <w:r>
-          <w:t>recorded in section 8.2</w:t>
-        </w:r>
-      </w:ins>
+      <w:r>
+        <w:t>recorded in section 8.2</w:t>
+      </w:r>
       <w:r>
         <w:t>; section 1.2 describes the engine as it was on 27 September. The coherence checks compare what the commitment cards record, which is the producer's statement of its contracts, not the documents themselves.</w:t>
       </w:r>
@@ -31704,16 +31118,9 @@
       <w:r>
         <w:t xml:space="preserve">. They are </w:t>
       </w:r>
-      <w:del w:id="9099" w:author="Claude" w:date="2026-10-21T17:00:00Z">
-        <w:r>
-          <w:delText>as of 27-30 September 2026.</w:delText>
-        </w:r>
-      </w:del>
-      <w:ins w:id="9100" w:author="Claude" w:date="2026-10-21T17:00:00Z">
-        <w:r>
-          <w:t>as of 27-30 September 2026 and were not refreshed for the 21 October edition.</w:t>
-        </w:r>
-      </w:ins>
+      <w:r>
+        <w:t>as of 27-30 September 2026 and were not refreshed for the 21 October edition.</w:t>
+      </w:r>
       <w:r>
         <w:t xml:space="preserve"> The EU Hydrogen Bank requirements come from the IF24 terms and conditions and the IF25 draft terms with CINEA's questions and answers (3 February 2026); check the final IF25 terms before relying on them.</w:t>
       </w:r>
@@ -31725,36 +31132,32 @@
           <w:ilvl w:val="0"/>
           <w:numId w:val="3"/>
         </w:numPr>
+        <w:rPr/>
+      </w:pPr>
+      <w:r>
         <w:rPr>
-          <w:ins w:id="9101" w:author="Claude" w:date="2026-10-21T17:00:00Z"/>
+          <w:b/>
+          <w:bCs/>
         </w:rPr>
-      </w:pPr>
-      <w:ins w:id="9102" w:author="Claude" w:date="2026-10-21T17:00:00Z">
-        <w:r>
-          <w:rPr>
-            <w:b/>
-            <w:bCs/>
-          </w:rPr>
-          <w:t>Open challenges.</w:t>
-        </w:r>
-        <w:r>
-          <w:rPr>
-            <w:b/>
-            <w:bCs/>
-          </w:rPr>
-          <w:t xml:space="preserve"> The challenge is not finished. These are the questions to re-test at each rules release, so the gates stay honest: </w:t>
-        </w:r>
-        <w:r>
-          <w:rPr>
-            <w:b/>
-            <w:bCs/>
-            <w:color w:val="A8341A"/>
-            <w:sz w:val="18"/>
-            <w:szCs w:val="18"/>
-          </w:rPr>
-          <w:t>[I]</w:t>
-        </w:r>
-      </w:ins>
+        <w:t>Open challenges.</w:t>
+      </w:r>
+      <w:r>
+        <w:rPr>
+          <w:b/>
+          <w:bCs/>
+        </w:rPr>
+        <w:t xml:space="preserve"> The challenge is not finished. These are the questions to re-test at each rules release, so the gates stay honest: </w:t>
+      </w:r>
+      <w:r>
+        <w:rPr>
+          <w:b/>
+          <w:bCs/>
+          <w:color w:val="A8341A"/>
+          <w:sz w:val="18"/>
+          <w:szCs w:val="18"/>
+        </w:rPr>
+        <w:t>[I]</w:t>
+      </w:r>
     </w:p>
     <w:p>
       <w:pPr>
@@ -31763,29 +31166,25 @@
           <w:ilvl w:val="0"/>
           <w:numId w:val="3"/>
         </w:numPr>
+        <w:rPr/>
+      </w:pPr>
+      <w:r>
         <w:rPr>
-          <w:ins w:id="9103" w:author="Claude" w:date="2026-10-21T17:00:00Z"/>
+          <w:b/>
+          <w:bCs/>
         </w:rPr>
-      </w:pPr>
-      <w:ins w:id="9104" w:author="Claude" w:date="2026-10-21T17:00:00Z">
-        <w:r>
-          <w:rPr>
-            <w:b/>
-            <w:bCs/>
-          </w:rPr>
-          <w:t xml:space="preserve">Reviewers: since 21 October a grant assessor, a seed investor’s adviser or a strategic investor’s adviser verifies the gate of its own decision. No reviewer of any kind is assigned on the platform yet, so no evidence can be verified until one is. </w:t>
-        </w:r>
-        <w:r>
-          <w:rPr>
-            <w:b/>
-            <w:bCs/>
-            <w:color w:val="3A4A46"/>
-            <w:sz w:val="18"/>
-            <w:szCs w:val="18"/>
-          </w:rPr>
-          <w:t>[GEX]</w:t>
-        </w:r>
-      </w:ins>
+        <w:t xml:space="preserve">Reviewers: since 21 October a grant assessor, a seed investor’s adviser or a strategic investor’s adviser verifies the gate of its own decision. No reviewer of any kind is assigned on the platform yet, so no evidence can be verified until one is. </w:t>
+      </w:r>
+      <w:r>
+        <w:rPr>
+          <w:b/>
+          <w:bCs/>
+          <w:color w:val="3A4A46"/>
+          <w:sz w:val="18"/>
+          <w:szCs w:val="18"/>
+        </w:rPr>
+        <w:t>[GEX]</w:t>
+      </w:r>
     </w:p>
     <w:p>
       <w:pPr>
@@ -31794,29 +31193,25 @@
           <w:ilvl w:val="0"/>
           <w:numId w:val="3"/>
         </w:numPr>
+        <w:rPr/>
+      </w:pPr>
+      <w:r>
         <w:rPr>
-          <w:ins w:id="9105" w:author="Claude" w:date="2026-10-21T17:00:00Z"/>
+          <w:b/>
+          <w:bCs/>
         </w:rPr>
-      </w:pPr>
-      <w:ins w:id="9106" w:author="Claude" w:date="2026-10-21T17:00:00Z">
-        <w:r>
-          <w:rPr>
-            <w:b/>
-            <w:bCs/>
-          </w:rPr>
-          <w:t xml:space="preserve">Insurance bound at G10 is verified by the lenders’ adviser, not the insurer, because review scope is set per gate. </w:t>
-        </w:r>
-        <w:r>
-          <w:rPr>
-            <w:b/>
-            <w:bCs/>
-            <w:color w:val="3A4A46"/>
-            <w:sz w:val="18"/>
-            <w:szCs w:val="18"/>
-          </w:rPr>
-          <w:t>[GEX]</w:t>
-        </w:r>
-      </w:ins>
+        <w:t xml:space="preserve">Insurance bound at G10 is verified by the lenders’ adviser, not the insurer, because review scope is set per gate. </w:t>
+      </w:r>
+      <w:r>
+        <w:rPr>
+          <w:b/>
+          <w:bCs/>
+          <w:color w:val="3A4A46"/>
+          <w:sz w:val="18"/>
+          <w:szCs w:val="18"/>
+        </w:rPr>
+        <w:t>[GEX]</w:t>
+      </w:r>
     </w:p>
     <w:p>
       <w:pPr>
@@ -31825,29 +31220,25 @@
           <w:ilvl w:val="0"/>
           <w:numId w:val="3"/>
         </w:numPr>
+        <w:rPr/>
+      </w:pPr>
+      <w:r>
         <w:rPr>
-          <w:ins w:id="9107" w:author="Claude" w:date="2026-10-21T17:00:00Z"/>
+          <w:b/>
+          <w:bCs/>
         </w:rPr>
-      </w:pPr>
-      <w:ins w:id="9108" w:author="Claude" w:date="2026-10-21T17:00:00Z">
-        <w:r>
-          <w:rPr>
-            <w:b/>
-            <w:bCs/>
-          </w:rPr>
-          <w:t xml:space="preserve">The coherence checks compare what the producer records on the cards, not the documents themselves. </w:t>
-        </w:r>
-        <w:r>
-          <w:rPr>
-            <w:b/>
-            <w:bCs/>
-            <w:color w:val="3A4A46"/>
-            <w:sz w:val="18"/>
-            <w:szCs w:val="18"/>
-          </w:rPr>
-          <w:t>[GEX]</w:t>
-        </w:r>
-      </w:ins>
+        <w:t xml:space="preserve">The coherence checks compare what the producer records on the cards, not the documents themselves. </w:t>
+      </w:r>
+      <w:r>
+        <w:rPr>
+          <w:b/>
+          <w:bCs/>
+          <w:color w:val="3A4A46"/>
+          <w:sz w:val="18"/>
+          <w:szCs w:val="18"/>
+        </w:rPr>
+        <w:t>[GEX]</w:t>
+      </w:r>
     </w:p>
     <w:p>
       <w:pPr>
@@ -31856,29 +31247,25 @@
           <w:ilvl w:val="0"/>
           <w:numId w:val="3"/>
         </w:numPr>
+        <w:rPr/>
+      </w:pPr>
+      <w:r>
         <w:rPr>
-          <w:ins w:id="9109" w:author="Claude" w:date="2026-10-21T17:00:00Z"/>
+          <w:b/>
+          <w:bCs/>
         </w:rPr>
-      </w:pPr>
-      <w:ins w:id="9110" w:author="Claude" w:date="2026-10-21T17:00:00Z">
-        <w:r>
-          <w:rPr>
-            <w:b/>
-            <w:bCs/>
-          </w:rPr>
-          <w:t xml:space="preserve">The capital-commitment ladder (section 6) and the Refinancing eligible state are not computed. </w:t>
-        </w:r>
-        <w:r>
-          <w:rPr>
-            <w:b/>
-            <w:bCs/>
-            <w:color w:val="3A4A46"/>
-            <w:sz w:val="18"/>
-            <w:szCs w:val="18"/>
-          </w:rPr>
-          <w:t>[GEX]</w:t>
-        </w:r>
-      </w:ins>
+        <w:t xml:space="preserve">The capital-commitment ladder (section 6) and the Refinancing eligible state are not computed. </w:t>
+      </w:r>
+      <w:r>
+        <w:rPr>
+          <w:b/>
+          <w:bCs/>
+          <w:color w:val="3A4A46"/>
+          <w:sz w:val="18"/>
+          <w:szCs w:val="18"/>
+        </w:rPr>
+        <w:t>[GEX]</w:t>
+      </w:r>
     </w:p>
     <w:p>
       <w:pPr>
@@ -31887,29 +31274,25 @@
           <w:ilvl w:val="0"/>
           <w:numId w:val="3"/>
         </w:numPr>
+        <w:rPr/>
+      </w:pPr>
+      <w:r>
         <w:rPr>
-          <w:ins w:id="9111" w:author="Claude" w:date="2026-10-21T17:00:00Z"/>
+          <w:b/>
+          <w:bCs/>
         </w:rPr>
-      </w:pPr>
-      <w:ins w:id="9112" w:author="Claude" w:date="2026-10-21T17:00:00Z">
-        <w:r>
-          <w:rPr>
-            <w:b/>
-            <w:bCs/>
-          </w:rPr>
-          <w:t xml:space="preserve">The thresholds (Class 3, O- and E-levels, 60% coverage and firmness) are calibrated on public cases, not yet on client files. </w:t>
-        </w:r>
-        <w:r>
-          <w:rPr>
-            <w:b/>
-            <w:bCs/>
-            <w:color w:val="A8341A"/>
-            <w:sz w:val="18"/>
-            <w:szCs w:val="18"/>
-          </w:rPr>
-          <w:t>[I]</w:t>
-        </w:r>
-      </w:ins>
+        <w:t xml:space="preserve">The thresholds (Class 3, O- and E-levels, 60% coverage and firmness) are calibrated on public cases, not yet on client files. </w:t>
+      </w:r>
+      <w:r>
+        <w:rPr>
+          <w:b/>
+          <w:bCs/>
+          <w:color w:val="A8341A"/>
+          <w:sz w:val="18"/>
+          <w:szCs w:val="18"/>
+        </w:rPr>
+        <w:t>[I]</w:t>
+      </w:r>
     </w:p>
     <w:p>
       <w:pPr>
@@ -31918,29 +31301,25 @@
           <w:ilvl w:val="0"/>
           <w:numId w:val="3"/>
         </w:numPr>
+        <w:rPr/>
+      </w:pPr>
+      <w:r>
         <w:rPr>
-          <w:ins w:id="9113" w:author="Claude" w:date="2026-10-21T17:00:00Z"/>
+          <w:b/>
+          <w:bCs/>
         </w:rPr>
-      </w:pPr>
-      <w:ins w:id="9114" w:author="Claude" w:date="2026-10-21T17:00:00Z">
-        <w:r>
-          <w:rPr>
-            <w:b/>
-            <w:bCs/>
-          </w:rPr>
-          <w:t xml:space="preserve">Electrolyser origin and environmental-permit applications, which the EU Hydrogen Bank tests at application, are not tested by GEX (section 10). </w:t>
-        </w:r>
-        <w:r>
-          <w:rPr>
-            <w:b/>
-            <w:bCs/>
-            <w:color w:val="3A4A46"/>
-            <w:sz w:val="18"/>
-            <w:szCs w:val="18"/>
-          </w:rPr>
-          <w:t>[GEX]</w:t>
-        </w:r>
-      </w:ins>
+        <w:t xml:space="preserve">Electrolyser origin and environmental-permit applications, which the EU Hydrogen Bank tests at application, are not tested by GEX (section 10). </w:t>
+      </w:r>
+      <w:r>
+        <w:rPr>
+          <w:b/>
+          <w:bCs/>
+          <w:color w:val="3A4A46"/>
+          <w:sz w:val="18"/>
+          <w:szCs w:val="18"/>
+        </w:rPr>
+        <w:t>[GEX]</w:t>
+      </w:r>
     </w:p>
     <w:p>
       <w:pPr>
@@ -33591,16 +32970,9 @@
         <w:lastRenderedPageBreak/>
         <w:t xml:space="preserve">Clean Air Task Force, Designing a </w:t>
       </w:r>
-      <w:del w:id="9200" w:author="Claude" w:date="2026-10-21T17:00:00Z">
-        <w:r>
-          <w:delText>‚Ç¨100bn</w:delText>
-        </w:r>
-      </w:del>
-      <w:ins w:id="9201" w:author="Claude" w:date="2026-10-21T17:00:00Z">
-        <w:r>
-          <w:t>€100bn</w:t>
-        </w:r>
-      </w:ins>
+      <w:r>
+        <w:t>€100bn</w:t>
+      </w:r>
       <w:r>
         <w:t xml:space="preserve"> Industrial Decarbonisation Bank to Deliver Operating Projects, July 2026 - catf.us</w:t>
       </w:r>
@@ -33964,1241 +33336,6 @@
     <w:p>
       <w:pPr>
         <w:spacing w:after="70"/>
-      </w:pPr>
-    </w:p>
-    <w:p>
-      <w:pPr>
-        <w:pStyle w:val="Heading1"/>
-        <w:keepNext/>
-        <w:spacing w:before="360" w:after="160"/>
-        <w:rPr>
-          <w:del w:id="9116" w:author="Claude" w:date="2026-10-21T17:00:00Z"/>
-        </w:rPr>
-      </w:pPr>
-      <w:del w:id="9115" w:author="Claude" w:date="2026-10-21T17:00:00Z">
-        <w:r>
-          <w:lastRenderedPageBreak/>
-          <w:delText>11. Reflection on Eropean H2  Bank bidding Failures</w:delText>
-        </w:r>
-      </w:del>
-    </w:p>
-    <w:p>
-      <w:pPr>
-        <w:spacing w:after="70"/>
-        <w:rPr>
-          <w:del w:id="9118" w:author="Claude" w:date="2026-10-21T17:00:00Z"/>
-          <w:i/>
-          <w:iCs/>
-        </w:rPr>
-      </w:pPr>
-      <w:del w:id="9117" w:author="Claude" w:date="2026-10-21T17:00:00Z">
-        <w:r>
-          <w:rPr>
-            <w:i/>
-            <w:iCs/>
-          </w:rPr>
-          <w:delText>1. S&amp;P Global Commodity Insights</w:delText>
-        </w:r>
-      </w:del>
-    </w:p>
-    <w:p>
-      <w:pPr>
-        <w:spacing w:after="70"/>
-        <w:rPr>
-          <w:del w:id="9120" w:author="Claude" w:date="2026-10-21T17:00:00Z"/>
-        </w:rPr>
-      </w:pPr>
-      <w:del w:id="9119" w:author="Claude" w:date="2026-10-21T17:00:00Z">
-        <w:r>
-          <w:rPr>
-            <w:b/>
-            <w:bCs/>
-          </w:rPr>
-          <w:delText>"Most project capacity of second EU Hydrogen Bank auction withdraws"</w:delText>
-        </w:r>
-      </w:del>
-    </w:p>
-    <w:p>
-      <w:pPr>
-        <w:spacing w:after="70"/>
-        <w:rPr>
-          <w:del w:id="9122" w:author="Claude" w:date="2026-10-21T17:00:00Z"/>
-        </w:rPr>
-      </w:pPr>
-      <w:del w:id="9121" w:author="Claude" w:date="2026-10-21T17:00:00Z">
-        <w:r>
-          <w:delText>S&amp;P Global highlighted that low bidding prices became a trap for developers once technical and commercial realities set in. Developers submitted hyper-competitive bids to win the auction, but when required to sign legally binding commitments and post financial guarantees, they realized:</w:delText>
-        </w:r>
-      </w:del>
-    </w:p>
-    <w:p>
-      <w:pPr>
-        <w:numPr>
-          <w:ilvl w:val="0"/>
-          <w:numId w:val="11"/>
-        </w:numPr>
-        <w:ind w:left="284" w:hanging="142"/>
-        <w:rPr>
-          <w:del w:id="9124" w:author="Claude" w:date="2026-10-21T17:00:00Z"/>
-        </w:rPr>
-      </w:pPr>
-      <w:del w:id="9123" w:author="Claude" w:date="2026-10-21T17:00:00Z">
-        <w:r>
-          <w:delText>They could not secure long-term renewable PPA contracts at the prices assumed in their financial models.</w:delText>
-        </w:r>
-      </w:del>
-    </w:p>
-    <w:p>
-      <w:pPr>
-        <w:numPr>
-          <w:ilvl w:val="0"/>
-          <w:numId w:val="11"/>
-        </w:numPr>
-        <w:ind w:left="284" w:hanging="142"/>
-        <w:rPr>
-          <w:del w:id="9126" w:author="Claude" w:date="2026-10-21T17:00:00Z"/>
-        </w:rPr>
-      </w:pPr>
-      <w:del w:id="9125" w:author="Claude" w:date="2026-10-21T17:00:00Z">
-        <w:r>
-          <w:delText>Permitting timelines and grid interconnections were delayed well beyond the EHB’s strict 5-year operational deadline.</w:delText>
-        </w:r>
-      </w:del>
-    </w:p>
-    <w:p>
-      <w:pPr>
-        <w:numPr>
-          <w:ilvl w:val="0"/>
-          <w:numId w:val="11"/>
-        </w:numPr>
-        <w:ind w:left="284" w:hanging="142"/>
-        <w:rPr>
-          <w:del w:id="9128" w:author="Claude" w:date="2026-10-21T17:00:00Z"/>
-        </w:rPr>
-      </w:pPr>
-      <w:del w:id="9127" w:author="Claude" w:date="2026-10-21T17:00:00Z">
-        <w:r>
-          <w:delText>Offtakers were unwilling to sign binding contracts without fixed delivered hydrogen prices.</w:delText>
-        </w:r>
-      </w:del>
-    </w:p>
-    <w:p>
-      <w:pPr>
-        <w:spacing w:after="70"/>
-        <w:rPr>
-          <w:del w:id="9130" w:author="Claude" w:date="2026-10-21T17:00:00Z"/>
-        </w:rPr>
-      </w:pPr>
-      <w:del w:id="9129" w:author="Claude" w:date="2026-10-21T17:00:00Z">
-        <w:r>
-          <w:rPr>
-            <w:b/>
-            <w:bCs/>
-          </w:rPr>
-          <w:delText>2. Balkan Green Energy News</w:delText>
-        </w:r>
-      </w:del>
-    </w:p>
-    <w:p>
-      <w:pPr>
-        <w:spacing w:after="70"/>
-        <w:rPr>
-          <w:del w:id="9132" w:author="Claude" w:date="2026-10-21T17:00:00Z"/>
-        </w:rPr>
-      </w:pPr>
-      <w:del w:id="9131" w:author="Claude" w:date="2026-10-21T17:00:00Z">
-        <w:r>
-          <w:delText xml:space="preserve"> The Market Reality</w:delText>
-        </w:r>
-        <w:r>
-          <w:rPr>
-            <w:b/>
-            <w:bCs/>
-          </w:rPr>
-          <w:delText>:</w:delText>
-        </w:r>
-        <w:r>
-          <w:rPr>
-            <w:rStyle w:val="apple-converted-space"/>
-          </w:rPr>
-          <w:delText> </w:delText>
-        </w:r>
-        <w:r>
-          <w:delText>Analysts countered that while it prevented wasted public money, the mechanism caused severe market churn. Over half the budget sat idle, and reserve-list projects invited to replace the dropouts lacked the scale to fill the 1.88 GW gap</w:delText>
-        </w:r>
-      </w:del>
-    </w:p>
-    <w:p>
-      <w:pPr>
-        <w:spacing w:after="70"/>
-        <w:rPr>
-          <w:del w:id="9134" w:author="Claude" w:date="2026-10-21T17:00:00Z"/>
-          <w:b/>
-          <w:bCs/>
-        </w:rPr>
-      </w:pPr>
-      <w:del w:id="9133" w:author="Claude" w:date="2026-10-21T17:00:00Z">
-        <w:r>
-          <w:rPr>
-            <w:b/>
-            <w:bCs/>
-          </w:rPr>
-          <w:delText>3. Clean Air Task Force (CATF) &amp; Tim Harper Analysis</w:delText>
-        </w:r>
-      </w:del>
-    </w:p>
-    <w:p>
-      <w:pPr>
-        <w:spacing w:after="70"/>
-        <w:rPr>
-          <w:del w:id="9136" w:author="Claude" w:date="2026-10-21T17:00:00Z"/>
-        </w:rPr>
-      </w:pPr>
-      <w:del w:id="9135" w:author="Claude" w:date="2026-10-21T17:00:00Z">
-        <w:r>
-          <w:rPr>
-            <w:b/>
-            <w:bCs/>
-          </w:rPr>
-          <w:delText>"Designing a €100bn Industrial Decarbonisation Bank to Deliver"</w:delText>
-        </w:r>
-        <w:r>
-          <w:delText> / </w:delText>
-        </w:r>
-        <w:r>
-          <w:rPr>
-            <w:b/>
-            <w:bCs/>
-          </w:rPr>
-          <w:delText>"IF25 European Hydrogen Auction Explained"</w:delText>
-        </w:r>
-      </w:del>
-    </w:p>
-    <w:p>
-      <w:pPr>
-        <w:spacing w:after="70"/>
-        <w:rPr>
-          <w:del w:id="9138" w:author="Claude" w:date="2026-10-21T17:00:00Z"/>
-        </w:rPr>
-      </w:pPr>
-      <w:del w:id="9137" w:author="Claude" w:date="2026-10-21T17:00:00Z">
-        <w:r>
-          <w:delText>Energy commentators noted that requiring bankable commitments (like financial completion guarantees) </w:delText>
-        </w:r>
-        <w:r>
-          <w:rPr>
-            <w:b/>
-            <w:bCs/>
-          </w:rPr>
-          <w:delText>before</w:delText>
-        </w:r>
-        <w:r>
-          <w:delText>projects have achieved developmental maturity creates a structural mismatch:</w:delText>
-        </w:r>
-      </w:del>
-    </w:p>
-    <w:p>
-      <w:pPr>
-        <w:numPr>
-          <w:ilvl w:val="0"/>
-          <w:numId w:val="8"/>
-        </w:numPr>
-        <w:spacing w:after="70"/>
-        <w:rPr>
-          <w:del w:id="9140" w:author="Claude" w:date="2026-10-21T17:00:00Z"/>
-        </w:rPr>
-      </w:pPr>
-      <w:del w:id="9139" w:author="Claude" w:date="2026-10-21T17:00:00Z">
-        <w:r>
-          <w:rPr>
-            <w:b/>
-            <w:bCs/>
-          </w:rPr>
-          <w:delText>Optionality vs. Obligation:</w:delText>
-        </w:r>
-        <w:r>
-          <w:delText> Bidders treat early-stage government auctions like free financial call options. If public frameworks demand hard financial guarantees too early in the project timeline, developers face a binary choice: post expensive capital for an unpermitted project or walk away.</w:delText>
-        </w:r>
-      </w:del>
-    </w:p>
-    <w:p>
-      <w:pPr>
-        <w:numPr>
-          <w:ilvl w:val="0"/>
-          <w:numId w:val="8"/>
-        </w:numPr>
-        <w:spacing w:after="70"/>
-        <w:rPr>
-          <w:del w:id="9142" w:author="Claude" w:date="2026-10-21T17:00:00Z"/>
-        </w:rPr>
-      </w:pPr>
-      <w:del w:id="9141" w:author="Claude" w:date="2026-10-21T17:00:00Z">
-        <w:r>
-          <w:rPr>
-            <w:b/>
-            <w:bCs/>
-          </w:rPr>
-          <w:delText>The Paradigm Shift:</w:delText>
-        </w:r>
-        <w:r>
-          <w:delText> Industry commentary shifted the core policy metric from </w:delText>
-        </w:r>
-        <w:r>
-          <w:rPr>
-            <w:i/>
-            <w:iCs/>
-          </w:rPr>
-          <w:delText>"How low can subsidy bids go?"</w:delText>
-        </w:r>
-        <w:r>
-          <w:delText>to </w:delText>
-        </w:r>
-        <w:r>
-          <w:rPr>
-            <w:i/>
-            <w:iCs/>
-          </w:rPr>
-          <w:delText>"How many winning projects actually reach Final Investment Decision (FID) and get built?"</w:delText>
-        </w:r>
-      </w:del>
-    </w:p>
-    <w:p>
-      <w:pPr>
-        <w:spacing w:after="70"/>
-        <w:rPr>
-          <w:del w:id="9144" w:author="Claude" w:date="2026-10-21T17:00:00Z"/>
-          <w:b/>
-          <w:bCs/>
-        </w:rPr>
-      </w:pPr>
-      <w:del w:id="9143" w:author="Claude" w:date="2026-10-21T17:00:00Z">
-        <w:r>
-          <w:rPr>
-            <w:b/>
-            <w:bCs/>
-          </w:rPr>
-          <w:delText>4. EY / Hyvolution Index Report</w:delText>
-        </w:r>
-      </w:del>
-    </w:p>
-    <w:p>
-      <w:pPr>
-        <w:spacing w:after="70"/>
-        <w:rPr>
-          <w:del w:id="9146" w:author="Claude" w:date="2026-10-21T17:00:00Z"/>
-        </w:rPr>
-      </w:pPr>
-      <w:del w:id="9145" w:author="Claude" w:date="2026-10-21T17:00:00Z">
-        <w:r>
-          <w:rPr>
-            <w:b/>
-            <w:bCs/>
-          </w:rPr>
-          <w:delText>"European Hydrogen and Derivatives Index"</w:delText>
-        </w:r>
-      </w:del>
-    </w:p>
-    <w:p>
-      <w:pPr>
-        <w:spacing w:after="70"/>
-        <w:rPr>
-          <w:del w:id="9148" w:author="Claude" w:date="2026-10-21T17:00:00Z"/>
-        </w:rPr>
-      </w:pPr>
-      <w:del w:id="9147" w:author="Claude" w:date="2026-10-21T17:00:00Z">
-        <w:r>
-          <w:delText>EY’s analysis emphasized that forcing 100% compliance with strict Renewable Fuels of Non-Biological Origin (RFNBO) rules and demanding bank guarantees before grid/PPA terms are finalized created an unbankable risk profile. The high attrition rate served as a wake-up call that regulatory complexity and early financial penalties were chilling developer participation.</w:delText>
-        </w:r>
-      </w:del>
-    </w:p>
-    <w:p>
-      <w:pPr>
-        <w:spacing w:after="70"/>
-        <w:rPr>
-          <w:del w:id="9150" w:author="Claude" w:date="2026-10-21T17:00:00Z"/>
-          <w:b/>
-          <w:bCs/>
-        </w:rPr>
-      </w:pPr>
-      <w:del w:id="9149" w:author="Claude" w:date="2026-10-21T17:00:00Z">
-        <w:r>
-          <w:rPr>
-            <w:b/>
-            <w:bCs/>
-          </w:rPr>
-          <w:delText>How Policy Evolved as a Result</w:delText>
-        </w:r>
-      </w:del>
-    </w:p>
-    <w:p>
-      <w:pPr>
-        <w:spacing w:after="70"/>
-        <w:rPr>
-          <w:del w:id="9152" w:author="Claude" w:date="2026-10-21T17:00:00Z"/>
-        </w:rPr>
-      </w:pPr>
-      <w:del w:id="9151" w:author="Claude" w:date="2026-10-21T17:00:00Z">
-        <w:r>
-          <w:delText>To fix this attrition loop, the European Commission adjusted the rules for subsequent auction rounds (IF25 and IF26):</w:delText>
-        </w:r>
-      </w:del>
-    </w:p>
-    <w:p>
-      <w:pPr>
-        <w:numPr>
-          <w:ilvl w:val="0"/>
-          <w:numId w:val="9"/>
-        </w:numPr>
-        <w:spacing w:after="70"/>
-        <w:rPr>
-          <w:del w:id="9154" w:author="Claude" w:date="2026-10-21T17:00:00Z"/>
-        </w:rPr>
-      </w:pPr>
-      <w:del w:id="9153" w:author="Claude" w:date="2026-10-21T17:00:00Z">
-        <w:r>
-          <w:rPr>
-            <w:b/>
-            <w:bCs/>
-          </w:rPr>
-          <w:delText>Stricter Front-Loaded Maturity Criteria:</w:delText>
-        </w:r>
-        <w:r>
-          <w:delText> Bidders must now submit pre-contractual term sheets (Heads of Terms / MoUs) for power supply and off-take, along with proven grid application status, </w:delText>
-        </w:r>
-        <w:r>
-          <w:rPr>
-            <w:i/>
-            <w:iCs/>
-          </w:rPr>
-          <w:delText>before</w:delText>
-        </w:r>
-        <w:r>
-          <w:delText> entering the auction.</w:delText>
-        </w:r>
-      </w:del>
-    </w:p>
-    <w:p>
-      <w:pPr>
-        <w:numPr>
-          <w:ilvl w:val="0"/>
-          <w:numId w:val="9"/>
-        </w:numPr>
-        <w:spacing w:after="70"/>
-        <w:rPr>
-          <w:del w:id="9156" w:author="Claude" w:date="2026-10-21T17:00:00Z"/>
-        </w:rPr>
-      </w:pPr>
-      <w:del w:id="9155" w:author="Claude" w:date="2026-10-21T17:00:00Z">
-        <w:r>
-          <w:rPr>
-            <w:b/>
-            <w:bCs/>
-          </w:rPr>
-          <w:delText>Standardized Completion Guarantees:</w:delText>
-        </w:r>
-        <w:r>
-          <w:delText> Clarified timing and terms for the 8% completion guarantee so developers can price the risk directly into their initial bids.</w:delText>
-        </w:r>
-      </w:del>
-    </w:p>
-    <w:p>
-      <w:pPr>
-        <w:numPr>
-          <w:ilvl w:val="0"/>
-          <w:numId w:val="9"/>
-        </w:numPr>
-        <w:spacing w:after="70"/>
-        <w:rPr>
-          <w:del w:id="9158" w:author="Claude" w:date="2026-10-21T17:00:00Z"/>
-        </w:rPr>
-      </w:pPr>
-      <w:del w:id="9157" w:author="Claude" w:date="2026-10-21T17:00:00Z">
-        <w:r>
-          <w:rPr>
-            <w:b/>
-            <w:bCs/>
-          </w:rPr>
-          <w:delText>Resilience &amp; Regional Caps:</w:delText>
-        </w:r>
-        <w:r>
-          <w:delText> Introduced stricter rules to prevent lowball bidding strategies relying on unproven equipment or unrealistic supply chains.</w:delText>
-        </w:r>
-      </w:del>
-    </w:p>
-    <w:p>
-      <w:pPr>
-        <w:spacing w:after="70"/>
-        <w:rPr>
-          <w:del w:id="9159" w:author="Claude" w:date="2026-10-21T17:00:00Z"/>
-        </w:rPr>
-      </w:pPr>
-    </w:p>
-    <w:p>
-      <w:pPr>
-        <w:shd w:val="clear" w:color="auto" w:fill="FFFFFF"/>
-        <w:rPr>
-          <w:del w:id="9161" w:author="Claude" w:date="2026-10-21T17:00:00Z"/>
-          <w:rFonts w:ascii="Arial" w:eastAsia="Times New Roman" w:hAnsi="Arial" w:cs="Arial"/>
-          <w:color w:val="2C303B"/>
-          <w:sz w:val="20"/>
-          <w:szCs w:val="20"/>
-        </w:rPr>
-      </w:pPr>
-      <w:del w:id="9160" w:author="Claude" w:date="2026-10-21T17:00:00Z">
-        <w:r>
-          <w:rPr>
-            <w:rFonts w:ascii="Arial" w:eastAsia="Times New Roman" w:hAnsi="Arial" w:cs="Arial"/>
-            <w:color w:val="2C303B"/>
-            <w:sz w:val="20"/>
-            <w:szCs w:val="20"/>
-          </w:rPr>
-          <w:delText>Projects must provide extensive documentation at application stage, including:</w:delText>
-        </w:r>
-      </w:del>
-    </w:p>
-    <w:p>
-      <w:pPr>
-        <w:numPr>
-          <w:ilvl w:val="0"/>
-          <w:numId w:val="12"/>
-        </w:numPr>
-        <w:shd w:val="clear" w:color="auto" w:fill="FFFFFF"/>
-        <w:tabs>
-          <w:tab w:val="clear" w:pos="720"/>
-          <w:tab w:val="num" w:pos="567"/>
-        </w:tabs>
-        <w:rPr>
-          <w:del w:id="9163" w:author="Claude" w:date="2026-10-21T17:00:00Z"/>
-          <w:rFonts w:asciiTheme="minorHAnsi" w:eastAsia="Times New Roman" w:hAnsiTheme="minorHAnsi" w:cstheme="minorHAnsi"/>
-          <w:color w:val="2C303B"/>
-          <w:sz w:val="16"/>
-          <w:szCs w:val="16"/>
-        </w:rPr>
-      </w:pPr>
-      <w:del w:id="9162" w:author="Claude" w:date="2026-10-21T17:00:00Z">
-        <w:r>
-          <w:rPr>
-            <w:rFonts w:asciiTheme="minorHAnsi" w:eastAsia="Times New Roman" w:hAnsiTheme="minorHAnsi" w:cstheme="minorHAnsi"/>
-            <w:color w:val="2C303B"/>
-            <w:sz w:val="16"/>
-            <w:szCs w:val="16"/>
-          </w:rPr>
-          <w:delText>Electricity sourcing strategy proving 60% of supply secured via pre-contractual agreements;</w:delText>
-        </w:r>
-      </w:del>
-    </w:p>
-    <w:p>
-      <w:pPr>
-        <w:numPr>
-          <w:ilvl w:val="0"/>
-          <w:numId w:val="12"/>
-        </w:numPr>
-        <w:shd w:val="clear" w:color="auto" w:fill="FFFFFF"/>
-        <w:tabs>
-          <w:tab w:val="clear" w:pos="720"/>
-          <w:tab w:val="num" w:pos="567"/>
-        </w:tabs>
-        <w:spacing w:before="100" w:beforeAutospacing="1"/>
-        <w:rPr>
-          <w:del w:id="9165" w:author="Claude" w:date="2026-10-21T17:00:00Z"/>
-          <w:rFonts w:asciiTheme="minorHAnsi" w:eastAsia="Times New Roman" w:hAnsiTheme="minorHAnsi" w:cstheme="minorHAnsi"/>
-          <w:color w:val="2C303B"/>
-          <w:sz w:val="16"/>
-          <w:szCs w:val="16"/>
-        </w:rPr>
-      </w:pPr>
-      <w:del w:id="9164" w:author="Claude" w:date="2026-10-21T17:00:00Z">
-        <w:r>
-          <w:rPr>
-            <w:rFonts w:asciiTheme="minorHAnsi" w:eastAsia="Times New Roman" w:hAnsiTheme="minorHAnsi" w:cstheme="minorHAnsi"/>
-            <w:color w:val="2C303B"/>
-            <w:sz w:val="16"/>
-            <w:szCs w:val="16"/>
-          </w:rPr>
-          <w:delText>Off-take agreements covering at least 60% of hydrogen output;</w:delText>
-        </w:r>
-      </w:del>
-    </w:p>
-    <w:p>
-      <w:pPr>
-        <w:numPr>
-          <w:ilvl w:val="0"/>
-          <w:numId w:val="12"/>
-        </w:numPr>
-        <w:shd w:val="clear" w:color="auto" w:fill="FFFFFF"/>
-        <w:tabs>
-          <w:tab w:val="clear" w:pos="720"/>
-          <w:tab w:val="num" w:pos="567"/>
-        </w:tabs>
-        <w:spacing w:before="100" w:beforeAutospacing="1"/>
-        <w:rPr>
-          <w:del w:id="9167" w:author="Claude" w:date="2026-10-21T17:00:00Z"/>
-          <w:rFonts w:asciiTheme="minorHAnsi" w:eastAsia="Times New Roman" w:hAnsiTheme="minorHAnsi" w:cstheme="minorHAnsi"/>
-          <w:color w:val="2C303B"/>
-          <w:sz w:val="16"/>
-          <w:szCs w:val="16"/>
-        </w:rPr>
-      </w:pPr>
-      <w:del w:id="9166" w:author="Claude" w:date="2026-10-21T17:00:00Z">
-        <w:r>
-          <w:rPr>
-            <w:rFonts w:asciiTheme="minorHAnsi" w:eastAsia="Times New Roman" w:hAnsiTheme="minorHAnsi" w:cstheme="minorHAnsi"/>
-            <w:color w:val="2C303B"/>
-            <w:sz w:val="16"/>
-            <w:szCs w:val="16"/>
-          </w:rPr>
-          <w:delText>Electrolyser procurement plans (MoUs or LoIs with suppliers);</w:delText>
-        </w:r>
-      </w:del>
-    </w:p>
-    <w:p>
-      <w:pPr>
-        <w:numPr>
-          <w:ilvl w:val="0"/>
-          <w:numId w:val="12"/>
-        </w:numPr>
-        <w:shd w:val="clear" w:color="auto" w:fill="FFFFFF"/>
-        <w:tabs>
-          <w:tab w:val="clear" w:pos="720"/>
-          <w:tab w:val="num" w:pos="567"/>
-        </w:tabs>
-        <w:spacing w:before="100" w:beforeAutospacing="1"/>
-        <w:rPr>
-          <w:del w:id="9169" w:author="Claude" w:date="2026-10-21T17:00:00Z"/>
-          <w:rFonts w:asciiTheme="minorHAnsi" w:eastAsia="Times New Roman" w:hAnsiTheme="minorHAnsi" w:cstheme="minorHAnsi"/>
-          <w:color w:val="2C303B"/>
-          <w:sz w:val="16"/>
-          <w:szCs w:val="16"/>
-        </w:rPr>
-      </w:pPr>
-      <w:del w:id="9168" w:author="Claude" w:date="2026-10-21T17:00:00Z">
-        <w:r>
-          <w:rPr>
-            <w:rFonts w:asciiTheme="minorHAnsi" w:eastAsia="Times New Roman" w:hAnsiTheme="minorHAnsi" w:cstheme="minorHAnsi"/>
-            <w:color w:val="2C303B"/>
-            <w:sz w:val="16"/>
-            <w:szCs w:val="16"/>
-          </w:rPr>
-          <w:delText>Environmental and grid connection permits;</w:delText>
-        </w:r>
-      </w:del>
-    </w:p>
-    <w:p>
-      <w:pPr>
-        <w:numPr>
-          <w:ilvl w:val="0"/>
-          <w:numId w:val="12"/>
-        </w:numPr>
-        <w:shd w:val="clear" w:color="auto" w:fill="FFFFFF"/>
-        <w:tabs>
-          <w:tab w:val="clear" w:pos="720"/>
-          <w:tab w:val="num" w:pos="567"/>
-        </w:tabs>
-        <w:spacing w:before="100" w:beforeAutospacing="1"/>
-        <w:rPr>
-          <w:del w:id="9171" w:author="Claude" w:date="2026-10-21T17:00:00Z"/>
-          <w:rFonts w:asciiTheme="minorHAnsi" w:eastAsia="Times New Roman" w:hAnsiTheme="minorHAnsi" w:cstheme="minorHAnsi"/>
-          <w:color w:val="2C303B"/>
-          <w:sz w:val="16"/>
-          <w:szCs w:val="16"/>
-        </w:rPr>
-      </w:pPr>
-      <w:del w:id="9170" w:author="Claude" w:date="2026-10-21T17:00:00Z">
-        <w:r>
-          <w:rPr>
-            <w:rFonts w:asciiTheme="minorHAnsi" w:eastAsia="Times New Roman" w:hAnsiTheme="minorHAnsi" w:cstheme="minorHAnsi"/>
-            <w:color w:val="2C303B"/>
-            <w:sz w:val="16"/>
-            <w:szCs w:val="16"/>
-          </w:rPr>
-          <w:lastRenderedPageBreak/>
-          <w:delText>Evidence of equity support for at least 60% of total financing;</w:delText>
-        </w:r>
-      </w:del>
-    </w:p>
-    <w:p>
-      <w:pPr>
-        <w:numPr>
-          <w:ilvl w:val="0"/>
-          <w:numId w:val="12"/>
-        </w:numPr>
-        <w:shd w:val="clear" w:color="auto" w:fill="FFFFFF"/>
-        <w:tabs>
-          <w:tab w:val="clear" w:pos="720"/>
-          <w:tab w:val="num" w:pos="567"/>
-        </w:tabs>
-        <w:spacing w:before="100" w:beforeAutospacing="1"/>
-        <w:rPr>
-          <w:del w:id="9173" w:author="Claude" w:date="2026-10-21T17:00:00Z"/>
-          <w:rFonts w:ascii="Arial" w:eastAsia="Times New Roman" w:hAnsi="Arial" w:cs="Arial"/>
-          <w:color w:val="2C303B"/>
-          <w:sz w:val="20"/>
-          <w:szCs w:val="20"/>
-        </w:rPr>
-      </w:pPr>
-      <w:del w:id="9172" w:author="Claude" w:date="2026-10-21T17:00:00Z">
-        <w:r>
-          <w:rPr>
-            <w:rFonts w:asciiTheme="minorHAnsi" w:eastAsia="Times New Roman" w:hAnsiTheme="minorHAnsi" w:cstheme="minorHAnsi"/>
-            <w:color w:val="2C303B"/>
-            <w:sz w:val="16"/>
-            <w:szCs w:val="16"/>
-          </w:rPr>
-          <w:delText>Completion guarantee equal to 8% of the maximum grant amount</w:delText>
-        </w:r>
-        <w:r>
-          <w:rPr>
-            <w:rFonts w:ascii="Arial" w:eastAsia="Times New Roman" w:hAnsi="Arial" w:cs="Arial"/>
-            <w:color w:val="2C303B"/>
-            <w:sz w:val="20"/>
-            <w:szCs w:val="20"/>
-          </w:rPr>
-          <w:delText>.</w:delText>
-        </w:r>
-      </w:del>
-    </w:p>
-    <w:p>
-      <w:pPr>
-        <w:shd w:val="clear" w:color="auto" w:fill="FFFFFF"/>
-        <w:rPr>
-          <w:del w:id="9175" w:author="Claude" w:date="2026-10-21T17:00:00Z"/>
-          <w:rFonts w:ascii="Arial" w:eastAsia="Times New Roman" w:hAnsi="Arial" w:cs="Arial"/>
-          <w:color w:val="2C303B"/>
-          <w:sz w:val="18"/>
-          <w:szCs w:val="18"/>
-        </w:rPr>
-      </w:pPr>
-      <w:del w:id="9174" w:author="Claude" w:date="2026-10-21T17:00:00Z">
-        <w:r>
-          <w:rPr>
-            <w:rFonts w:ascii="Arial" w:eastAsia="Times New Roman" w:hAnsi="Arial" w:cs="Arial"/>
-            <w:color w:val="2C303B"/>
-            <w:sz w:val="18"/>
-            <w:szCs w:val="18"/>
-          </w:rPr>
-          <w:delText>These requirements ensure only mature, bankable projects enter the competition</w:delText>
-        </w:r>
-      </w:del>
-    </w:p>
-    <w:p>
-      <w:pPr>
-        <w:spacing w:after="70"/>
-        <w:rPr>
-          <w:del w:id="9176" w:author="Claude" w:date="2026-10-21T17:00:00Z"/>
-          <w:sz w:val="20"/>
-          <w:szCs w:val="20"/>
-        </w:rPr>
-      </w:pPr>
-    </w:p>
-    <w:p>
-      <w:pPr>
-        <w:rPr>
-          <w:del w:id="9178" w:author="Claude" w:date="2026-10-21T17:00:00Z"/>
-          <w:b/>
-          <w:bCs/>
-        </w:rPr>
-      </w:pPr>
-      <w:del w:id="9177" w:author="Claude" w:date="2026-10-21T17:00:00Z">
-        <w:r>
-          <w:rPr>
-            <w:b/>
-            <w:bCs/>
-          </w:rPr>
-          <w:delText xml:space="preserve">Mandatory Cross-Checks Before Auction Submission</w:delText>
-        </w:r>
-      </w:del>
-    </w:p>
-    <w:tbl>
-      <w:tblPr>
-        <w:tblW w:w="8505" w:type="dxa"/>
-        <w:tblCellSpacing w:w="15" w:type="dxa"/>
-        <w:shd w:val="clear" w:color="auto" w:fill="F2F2F2" w:themeFill="background1" w:themeFillShade="F2"/>
-        <w:tblCellMar>
-          <w:top w:w="15" w:type="dxa"/>
-          <w:left w:w="15" w:type="dxa"/>
-          <w:bottom w:w="15" w:type="dxa"/>
-          <w:right w:w="15" w:type="dxa"/>
-        </w:tblCellMar>
-        <w:tblLook w:val="04A0" w:firstRow="1" w:lastRow="0" w:firstColumn="1" w:lastColumn="0" w:noHBand="0" w:noVBand="1"/>
-      </w:tblPr>
-      <w:tblGrid>
-        <w:gridCol w:w="1276"/>
-        <w:gridCol w:w="2693"/>
-        <w:gridCol w:w="4536"/>
-      </w:tblGrid>
-      <w:tr>
-        <w:trPr>
-          <w:tblHeader/>
-          <w:tblCellSpacing w:w="15" w:type="dxa"/>
-          <w:del w:id="9179" w:author="Claude" w:date="2026-10-21T17:00:00Z"/>
-        </w:trPr>
-        <w:tc>
-          <w:tcPr>
-            <w:tcW w:w="1231" w:type="dxa"/>
-            <w:shd w:val="clear" w:color="auto" w:fill="F2F2F2" w:themeFill="background1" w:themeFillShade="F2"/>
-            <w:hideMark/>
-          </w:tcPr>
-          <w:p>
-            <w:pPr>
-              <w:jc w:val="center"/>
-              <w:rPr>
-                <w:rFonts w:ascii="Helvetica Neue" w:eastAsia="Times New Roman" w:hAnsi="Helvetica Neue" w:cs="Times New Roman"/>
-                <w:b/>
-                <w:bCs/>
-                <w:color w:val="1F1F1F"/>
-                <w:sz w:val="18"/>
-                <w:szCs w:val="18"/>
-              </w:rPr>
-            </w:pPr>
-            <w:del w:id="9180" w:author="Claude" w:date="2026-10-21T17:00:00Z">
-              <w:r>
-                <w:rPr>
-                  <w:rFonts w:ascii="Helvetica Neue" w:eastAsia="Times New Roman" w:hAnsi="Helvetica Neue" w:cs="Times New Roman"/>
-                  <w:b/>
-                  <w:bCs/>
-                  <w:color w:val="1F1F1F"/>
-                  <w:sz w:val="18"/>
-                  <w:szCs w:val="18"/>
-                </w:rPr>
-                <w:delText>Parameter</w:delText>
-              </w:r>
-            </w:del>
-          </w:p>
-        </w:tc>
-        <w:tc>
-          <w:tcPr>
-            <w:tcW w:w="2663" w:type="dxa"/>
-            <w:shd w:val="clear" w:color="auto" w:fill="F2F2F2" w:themeFill="background1" w:themeFillShade="F2"/>
-            <w:hideMark/>
-          </w:tcPr>
-          <w:p>
-            <w:pPr>
-              <w:jc w:val="center"/>
-              <w:rPr>
-                <w:rFonts w:ascii="Helvetica Neue" w:eastAsia="Times New Roman" w:hAnsi="Helvetica Neue" w:cs="Times New Roman"/>
-                <w:b/>
-                <w:bCs/>
-                <w:color w:val="1F1F1F"/>
-                <w:sz w:val="18"/>
-                <w:szCs w:val="18"/>
-              </w:rPr>
-            </w:pPr>
-            <w:del w:id="9181" w:author="Claude" w:date="2026-10-21T17:00:00Z">
-              <w:r>
-                <w:rPr>
-                  <w:rFonts w:ascii="Helvetica Neue" w:eastAsia="Times New Roman" w:hAnsi="Helvetica Neue" w:cs="Times New Roman"/>
-                  <w:b/>
-                  <w:bCs/>
-                  <w:color w:val="1F1F1F"/>
-                  <w:sz w:val="18"/>
-                  <w:szCs w:val="18"/>
-                </w:rPr>
-                <w:delText>Minimum Requirement</w:delText>
-              </w:r>
-            </w:del>
-          </w:p>
-        </w:tc>
-        <w:tc>
-          <w:tcPr>
-            <w:tcW w:w="4491" w:type="dxa"/>
-            <w:shd w:val="clear" w:color="auto" w:fill="F2F2F2" w:themeFill="background1" w:themeFillShade="F2"/>
-            <w:hideMark/>
-          </w:tcPr>
-          <w:p>
-            <w:pPr>
-              <w:jc w:val="center"/>
-              <w:rPr>
-                <w:rFonts w:ascii="Helvetica Neue" w:eastAsia="Times New Roman" w:hAnsi="Helvetica Neue" w:cs="Times New Roman"/>
-                <w:b/>
-                <w:bCs/>
-                <w:color w:val="1F1F1F"/>
-                <w:sz w:val="18"/>
-                <w:szCs w:val="18"/>
-              </w:rPr>
-            </w:pPr>
-            <w:del w:id="9182" w:author="Claude" w:date="2026-10-21T17:00:00Z">
-              <w:r>
-                <w:rPr>
-                  <w:rFonts w:ascii="Helvetica Neue" w:eastAsia="Times New Roman" w:hAnsi="Helvetica Neue" w:cs="Times New Roman"/>
-                  <w:b/>
-                  <w:bCs/>
-                  <w:color w:val="1F1F1F"/>
-                  <w:sz w:val="18"/>
-                  <w:szCs w:val="18"/>
-                </w:rPr>
-                <w:delText>Common Rejection Reason</w:delText>
-              </w:r>
-            </w:del>
-          </w:p>
-        </w:tc>
-      </w:tr>
-      <w:tr>
-        <w:trPr>
-          <w:tblCellSpacing w:w="15" w:type="dxa"/>
-          <w:del w:id="9183" w:author="Claude" w:date="2026-10-21T17:00:00Z"/>
-        </w:trPr>
-        <w:tc>
-          <w:tcPr>
-            <w:tcW w:w="1231" w:type="dxa"/>
-            <w:shd w:val="clear" w:color="auto" w:fill="F2F2F2" w:themeFill="background1" w:themeFillShade="F2"/>
-            <w:hideMark/>
-          </w:tcPr>
-          <w:p>
-            <w:pPr>
-              <w:rPr>
-                <w:rFonts w:ascii="Helvetica Neue" w:eastAsia="Times New Roman" w:hAnsi="Helvetica Neue" w:cs="Times New Roman"/>
-                <w:color w:val="1F1F1F"/>
-                <w:sz w:val="18"/>
-                <w:szCs w:val="18"/>
-              </w:rPr>
-            </w:pPr>
-            <w:del w:id="9184" w:author="Claude" w:date="2026-10-21T17:00:00Z">
-              <w:r>
-                <w:rPr>
-                  <w:rFonts w:ascii="Helvetica Neue" w:eastAsia="Times New Roman" w:hAnsi="Helvetica Neue" w:cs="Times New Roman"/>
-                  <w:color w:val="1F1F1F"/>
-                  <w:sz w:val="18"/>
-                  <w:szCs w:val="18"/>
-                </w:rPr>
-                <w:delText>PPA Coverage</w:delText>
-              </w:r>
-            </w:del>
-          </w:p>
-        </w:tc>
-        <w:tc>
-          <w:tcPr>
-            <w:tcW w:w="2663" w:type="dxa"/>
-            <w:shd w:val="clear" w:color="auto" w:fill="F2F2F2" w:themeFill="background1" w:themeFillShade="F2"/>
-            <w:hideMark/>
-          </w:tcPr>
-          <w:p>
-            <w:pPr>
-              <w:rPr>
-                <w:rFonts w:ascii="Helvetica Neue" w:eastAsia="Times New Roman" w:hAnsi="Helvetica Neue" w:cs="Times New Roman"/>
-                <w:color w:val="1F1F1F"/>
-                <w:sz w:val="18"/>
-                <w:szCs w:val="18"/>
-              </w:rPr>
-            </w:pPr>
-            <w:del w:id="9185" w:author="Claude" w:date="2026-10-21T17:00:00Z">
-              <w:r>
-                <w:rPr>
-                  <w:rFonts w:ascii="Helvetica Neue" w:eastAsia="Times New Roman" w:hAnsi="Helvetica Neue" w:cs="Times New Roman"/>
-                  <w:color w:val="1F1F1F"/>
-                  <w:sz w:val="18"/>
-                  <w:szCs w:val="18"/>
-                </w:rPr>
-                <w:delText>≥ 60% of required annual MWh</w:delText>
-              </w:r>
-            </w:del>
-          </w:p>
-        </w:tc>
-        <w:tc>
-          <w:tcPr>
-            <w:tcW w:w="4491" w:type="dxa"/>
-            <w:shd w:val="clear" w:color="auto" w:fill="F2F2F2" w:themeFill="background1" w:themeFillShade="F2"/>
-            <w:hideMark/>
-          </w:tcPr>
-          <w:p>
-            <w:pPr>
-              <w:rPr>
-                <w:rFonts w:ascii="Helvetica Neue" w:eastAsia="Times New Roman" w:hAnsi="Helvetica Neue" w:cs="Times New Roman"/>
-                <w:color w:val="1F1F1F"/>
-                <w:sz w:val="18"/>
-                <w:szCs w:val="18"/>
-              </w:rPr>
-            </w:pPr>
-            <w:del w:id="9186" w:author="Claude" w:date="2026-10-21T17:00:00Z">
-              <w:r>
-                <w:rPr>
-                  <w:rFonts w:ascii="Helvetica Neue" w:eastAsia="Times New Roman" w:hAnsi="Helvetica Neue" w:cs="Times New Roman"/>
-                  <w:color w:val="1F1F1F"/>
-                  <w:sz w:val="18"/>
-                  <w:szCs w:val="18"/>
-                </w:rPr>
-                <w:delText>Submitting an MoU with an energy broker instead of an asset owner or licensed utility.</w:delText>
-              </w:r>
-            </w:del>
-          </w:p>
-        </w:tc>
-      </w:tr>
-      <w:tr>
-        <w:trPr>
-          <w:tblCellSpacing w:w="15" w:type="dxa"/>
-          <w:del w:id="9187" w:author="Claude" w:date="2026-10-21T17:00:00Z"/>
-        </w:trPr>
-        <w:tc>
-          <w:tcPr>
-            <w:tcW w:w="1231" w:type="dxa"/>
-            <w:shd w:val="clear" w:color="auto" w:fill="F2F2F2" w:themeFill="background1" w:themeFillShade="F2"/>
-            <w:hideMark/>
-          </w:tcPr>
-          <w:p>
-            <w:pPr>
-              <w:rPr>
-                <w:rFonts w:ascii="Helvetica Neue" w:eastAsia="Times New Roman" w:hAnsi="Helvetica Neue" w:cs="Times New Roman"/>
-                <w:color w:val="1F1F1F"/>
-                <w:sz w:val="18"/>
-                <w:szCs w:val="18"/>
-              </w:rPr>
-            </w:pPr>
-            <w:del w:id="9188" w:author="Claude" w:date="2026-10-21T17:00:00Z">
-              <w:r>
-                <w:rPr>
-                  <w:rFonts w:ascii="Helvetica Neue" w:eastAsia="Times New Roman" w:hAnsi="Helvetica Neue" w:cs="Times New Roman"/>
-                  <w:color w:val="1F1F1F"/>
-                  <w:sz w:val="18"/>
-                  <w:szCs w:val="18"/>
-                </w:rPr>
-                <w:delText>Off-take Volume</w:delText>
-              </w:r>
-            </w:del>
-          </w:p>
-        </w:tc>
-        <w:tc>
-          <w:tcPr>
-            <w:tcW w:w="2663" w:type="dxa"/>
-            <w:shd w:val="clear" w:color="auto" w:fill="F2F2F2" w:themeFill="background1" w:themeFillShade="F2"/>
-            <w:hideMark/>
-          </w:tcPr>
-          <w:p>
-            <w:pPr>
-              <w:rPr>
-                <w:rFonts w:ascii="Helvetica Neue" w:eastAsia="Times New Roman" w:hAnsi="Helvetica Neue" w:cs="Times New Roman"/>
-                <w:color w:val="1F1F1F"/>
-                <w:sz w:val="18"/>
-                <w:szCs w:val="18"/>
-              </w:rPr>
-            </w:pPr>
-            <w:del w:id="9189" w:author="Claude" w:date="2026-10-21T17:00:00Z">
-              <w:r>
-                <w:rPr>
-                  <w:rFonts w:ascii="Helvetica Neue" w:eastAsia="Times New Roman" w:hAnsi="Helvetica Neue" w:cs="Times New Roman"/>
-                  <w:color w:val="1F1F1F"/>
-                  <w:sz w:val="18"/>
-                  <w:szCs w:val="18"/>
-                </w:rPr>
-                <w:delText>≥ 60% of 10-year H₂ production</w:delText>
-              </w:r>
-            </w:del>
-          </w:p>
-        </w:tc>
-        <w:tc>
-          <w:tcPr>
-            <w:tcW w:w="4491" w:type="dxa"/>
-            <w:shd w:val="clear" w:color="auto" w:fill="F2F2F2" w:themeFill="background1" w:themeFillShade="F2"/>
-            <w:hideMark/>
-          </w:tcPr>
-          <w:p>
-            <w:pPr>
-              <w:rPr>
-                <w:rFonts w:ascii="Helvetica Neue" w:eastAsia="Times New Roman" w:hAnsi="Helvetica Neue" w:cs="Times New Roman"/>
-                <w:color w:val="1F1F1F"/>
-                <w:sz w:val="18"/>
-                <w:szCs w:val="18"/>
-              </w:rPr>
-            </w:pPr>
-            <w:del w:id="9190" w:author="Claude" w:date="2026-10-21T17:00:00Z">
-              <w:r>
-                <w:rPr>
-                  <w:rFonts w:ascii="Helvetica Neue" w:eastAsia="Times New Roman" w:hAnsi="Helvetica Neue" w:cs="Times New Roman"/>
-                  <w:color w:val="1F1F1F"/>
-                  <w:sz w:val="18"/>
-                  <w:szCs w:val="18"/>
-                </w:rPr>
-                <w:delText>Off-taker lacks corporate sign-off or price formula is undefined.</w:delText>
-              </w:r>
-            </w:del>
-          </w:p>
-        </w:tc>
-      </w:tr>
-      <w:tr>
-        <w:trPr>
-          <w:tblCellSpacing w:w="15" w:type="dxa"/>
-          <w:del w:id="9191" w:author="Claude" w:date="2026-10-21T17:00:00Z"/>
-        </w:trPr>
-        <w:tc>
-          <w:tcPr>
-            <w:tcW w:w="1231" w:type="dxa"/>
-            <w:shd w:val="clear" w:color="auto" w:fill="F2F2F2" w:themeFill="background1" w:themeFillShade="F2"/>
-            <w:hideMark/>
-          </w:tcPr>
-          <w:p>
-            <w:pPr>
-              <w:rPr>
-                <w:rFonts w:ascii="Helvetica Neue" w:eastAsia="Times New Roman" w:hAnsi="Helvetica Neue" w:cs="Times New Roman"/>
-                <w:color w:val="1F1F1F"/>
-                <w:sz w:val="18"/>
-                <w:szCs w:val="18"/>
-              </w:rPr>
-            </w:pPr>
-            <w:del w:id="9192" w:author="Claude" w:date="2026-10-21T17:00:00Z">
-              <w:r>
-                <w:rPr>
-                  <w:rFonts w:ascii="Helvetica Neue" w:eastAsia="Times New Roman" w:hAnsi="Helvetica Neue" w:cs="Times New Roman"/>
-                  <w:color w:val="1F1F1F"/>
-                  <w:sz w:val="18"/>
-                  <w:szCs w:val="18"/>
-                </w:rPr>
-                <w:delText>Grid Status</w:delText>
-              </w:r>
-            </w:del>
-          </w:p>
-        </w:tc>
-        <w:tc>
-          <w:tcPr>
-            <w:tcW w:w="2663" w:type="dxa"/>
-            <w:shd w:val="clear" w:color="auto" w:fill="F2F2F2" w:themeFill="background1" w:themeFillShade="F2"/>
-            <w:hideMark/>
-          </w:tcPr>
-          <w:p>
-            <w:pPr>
-              <w:rPr>
-                <w:rFonts w:ascii="Helvetica Neue" w:eastAsia="Times New Roman" w:hAnsi="Helvetica Neue" w:cs="Times New Roman"/>
-                <w:color w:val="1F1F1F"/>
-                <w:sz w:val="18"/>
-                <w:szCs w:val="18"/>
-              </w:rPr>
-            </w:pPr>
-            <w:del w:id="9193" w:author="Claude" w:date="2026-10-21T17:00:00Z">
-              <w:r>
-                <w:rPr>
-                  <w:rFonts w:ascii="Helvetica Neue" w:eastAsia="Times New Roman" w:hAnsi="Helvetica Neue" w:cs="Times New Roman"/>
-                  <w:color w:val="1F1F1F"/>
-                  <w:sz w:val="18"/>
-                  <w:szCs w:val="18"/>
-                </w:rPr>
-                <w:delText>Evidence of formal TSO/DSO submission or offer</w:delText>
-              </w:r>
-            </w:del>
-          </w:p>
-        </w:tc>
-        <w:tc>
-          <w:tcPr>
-            <w:tcW w:w="4491" w:type="dxa"/>
-            <w:shd w:val="clear" w:color="auto" w:fill="F2F2F2" w:themeFill="background1" w:themeFillShade="F2"/>
-            <w:hideMark/>
-          </w:tcPr>
-          <w:p>
-            <w:pPr>
-              <w:rPr>
-                <w:rFonts w:ascii="Helvetica Neue" w:eastAsia="Times New Roman" w:hAnsi="Helvetica Neue" w:cs="Times New Roman"/>
-                <w:color w:val="1F1F1F"/>
-                <w:sz w:val="18"/>
-                <w:szCs w:val="18"/>
-              </w:rPr>
-            </w:pPr>
-            <w:del w:id="9194" w:author="Claude" w:date="2026-10-21T17:00:00Z">
-              <w:r>
-                <w:rPr>
-                  <w:rFonts w:ascii="Helvetica Neue" w:eastAsia="Times New Roman" w:hAnsi="Helvetica Neue" w:cs="Times New Roman"/>
-                  <w:color w:val="1F1F1F"/>
-                  <w:sz w:val="18"/>
-                  <w:szCs w:val="18"/>
-                </w:rPr>
-                <w:delText>Indicating "unsolicited intent" without an official TSO/DSO reference number.</w:delText>
-              </w:r>
-            </w:del>
-          </w:p>
-        </w:tc>
-      </w:tr>
-      <w:tr>
-        <w:trPr>
-          <w:tblCellSpacing w:w="15" w:type="dxa"/>
-          <w:del w:id="9195" w:author="Claude" w:date="2026-10-21T17:00:00Z"/>
-        </w:trPr>
-        <w:tc>
-          <w:tcPr>
-            <w:tcW w:w="1231" w:type="dxa"/>
-            <w:shd w:val="clear" w:color="auto" w:fill="F2F2F2" w:themeFill="background1" w:themeFillShade="F2"/>
-            <w:hideMark/>
-          </w:tcPr>
-          <w:p>
-            <w:pPr>
-              <w:rPr>
-                <w:rFonts w:ascii="Helvetica Neue" w:eastAsia="Times New Roman" w:hAnsi="Helvetica Neue" w:cs="Times New Roman"/>
-                <w:color w:val="1F1F1F"/>
-                <w:sz w:val="18"/>
-                <w:szCs w:val="18"/>
-              </w:rPr>
-            </w:pPr>
-            <w:del w:id="9196" w:author="Claude" w:date="2026-10-21T17:00:00Z">
-              <w:r>
-                <w:rPr>
-                  <w:rFonts w:ascii="Helvetica Neue" w:eastAsia="Times New Roman" w:hAnsi="Helvetica Neue" w:cs="Times New Roman"/>
-                  <w:color w:val="1F1F1F"/>
-                  <w:sz w:val="18"/>
-                  <w:szCs w:val="18"/>
-                </w:rPr>
-                <w:delText>Electrolyser Procurement</w:delText>
-              </w:r>
-            </w:del>
-          </w:p>
-        </w:tc>
-        <w:tc>
-          <w:tcPr>
-            <w:tcW w:w="2663" w:type="dxa"/>
-            <w:shd w:val="clear" w:color="auto" w:fill="F2F2F2" w:themeFill="background1" w:themeFillShade="F2"/>
-            <w:hideMark/>
-          </w:tcPr>
-          <w:p>
-            <w:pPr>
-              <w:rPr>
-                <w:rFonts w:ascii="Helvetica Neue" w:eastAsia="Times New Roman" w:hAnsi="Helvetica Neue" w:cs="Times New Roman"/>
-                <w:color w:val="1F1F1F"/>
-                <w:sz w:val="18"/>
-                <w:szCs w:val="18"/>
-              </w:rPr>
-            </w:pPr>
-            <w:del w:id="9197" w:author="Claude" w:date="2026-10-21T17:00:00Z">
-              <w:r>
-                <w:rPr>
-                  <w:rFonts w:ascii="Helvetica Neue" w:eastAsia="Times New Roman" w:hAnsi="Helvetica Neue" w:cs="Times New Roman"/>
-                  <w:color w:val="1F1F1F"/>
-                  <w:sz w:val="18"/>
-                  <w:szCs w:val="18"/>
-                </w:rPr>
-                <w:delText>Signed MoU with manufacturer specifying country of origin</w:delText>
-              </w:r>
-            </w:del>
-          </w:p>
-        </w:tc>
-        <w:tc>
-          <w:tcPr>
-            <w:tcW w:w="4491" w:type="dxa"/>
-            <w:shd w:val="clear" w:color="auto" w:fill="F2F2F2" w:themeFill="background1" w:themeFillShade="F2"/>
-            <w:hideMark/>
-          </w:tcPr>
-          <w:p>
-            <w:pPr>
-              <w:rPr>
-                <w:rFonts w:ascii="Helvetica Neue" w:eastAsia="Times New Roman" w:hAnsi="Helvetica Neue" w:cs="Times New Roman"/>
-                <w:color w:val="1F1F1F"/>
-                <w:sz w:val="18"/>
-                <w:szCs w:val="18"/>
-              </w:rPr>
-            </w:pPr>
-            <w:del w:id="9198" w:author="Claude" w:date="2026-10-21T17:00:00Z">
-              <w:r>
-                <w:rPr>
-                  <w:rFonts w:ascii="Helvetica Neue" w:eastAsia="Times New Roman" w:hAnsi="Helvetica Neue" w:cs="Times New Roman"/>
-                  <w:color w:val="1F1F1F"/>
-                  <w:sz w:val="18"/>
-                  <w:szCs w:val="18"/>
-                </w:rPr>
-                <w:delText>Failure to comply with Net Zero Industry Act (NZIA) non-EU stack sourcing limits.</w:delText>
-              </w:r>
-            </w:del>
-          </w:p>
-        </w:tc>
-      </w:tr>
-    </w:tbl>
-    <w:p>
-      <w:pPr>
-        <w:pStyle w:val="Heading2"/>
-        <w:rPr>
-          <w:del w:id="9199" w:author="Claude" w:date="2026-10-21T17:00:00Z"/>
-        </w:rPr>
       </w:pPr>
     </w:p>
     <w:p>

</xml_diff>

<commit_message>
Twelve-gates review: table of contents rebuilt, G1 renamed in §2
The table of contents is regenerated from the headings: 48 entries, including
the front section, §10 on the EU Hydrogen Bank and the three annexes, every
one linked (five headings gained a _Toc bookmark). Page numbers are left for
Word: the field is marked dirty, so Word recomputes it on opening.

§2's G1 heading, and its contents entry, now use the current gate name,
"Power, Utilities & Technology Basis".

Co-Authored-By: Claude Opus 5.5 <noreply@anthropic.com>
</commit_message>
<xml_diff>
--- a/gex-platform-enhanced/docs/GEX-12Gates-Multi-Party-Review_Good.docx
+++ b/gex-platform-enhanced/docs/GEX-12Gates-Multi-Party-Review_Good.docx
@@ -556,7 +556,7 @@
         </w:rPr>
       </w:pPr>
       <w:r>
-        <w:fldChar w:fldCharType="begin"/>
+        <w:fldChar w:fldCharType="begin" w:dirty="true"/>
         <w:instrText xml:space="preserve"> TOC \o "1-3" \h \z \u </w:instrText>
         <w:fldChar w:fldCharType="separate"/>
       </w:r>
@@ -566,7 +566,7 @@
             <w:rStyle w:val="Hyperlink"/>
             <w:noProof/>
           </w:rPr>
-          <w:t>1. Executive Summary with a critique</w:t>
+          <w:t>The twelve gates today (evidence rules 4.1.0)</w:t>
         </w:r>
         <w:r>
           <w:rPr>
@@ -577,7 +577,47 @@
           <w:fldChar w:fldCharType="begin"/>
           <w:instrText xml:space="preserve"> PAGEREF _Toc241505176 \h </w:instrText>
           <w:fldChar w:fldCharType="separate"/>
-          <w:t>4</w:t>
+          <w:t/>
+          <w:fldChar w:fldCharType="end"/>
+        </w:r>
+      </w:hyperlink>
+    </w:p>
+    <w:p>
+      <w:pPr>
+        <w:pStyle w:val="TOC1"/>
+        <w:tabs>
+          <w:tab w:val="right" w:leader="dot" w:pos="9350"/>
+        </w:tabs>
+        <w:spacing w:before="0"/>
+        <w:rPr>
+          <w:rFonts w:asciiTheme="minorHAnsi" w:eastAsiaTheme="minorEastAsia" w:hAnsiTheme="minorHAnsi" w:cstheme="minorBidi"/>
+          <w:b w:val="0"/>
+          <w:bCs w:val="0"/>
+          <w:caps w:val="0"/>
+          <w:noProof/>
+          <w:color w:val="auto"/>
+          <w:kern w:val="2"/>
+          <w14:ligatures w14:val="standardContextual"/>
+        </w:rPr>
+      </w:pPr>
+      <w:hyperlink w:anchor="_Toc2610220001" w:history="1">
+        <w:r>
+          <w:rPr>
+            <w:rStyle w:val="Hyperlink"/>
+            <w:noProof/>
+          </w:rPr>
+          <w:t>1. Executive Summary - Reasoning for the Gates</w:t>
+        </w:r>
+        <w:r>
+          <w:rPr>
+            <w:noProof/>
+            <w:webHidden/>
+          </w:rPr>
+          <w:tab/>
+          <w:fldChar w:fldCharType="begin"/>
+          <w:instrText xml:space="preserve"> PAGEREF _Toc2610220001 \h </w:instrText>
+          <w:fldChar w:fldCharType="separate"/>
+          <w:t/>
           <w:fldChar w:fldCharType="end"/>
         </w:r>
       </w:hyperlink>
@@ -607,7 +647,7 @@
             <w:rStyle w:val="Hyperlink"/>
             <w:noProof/>
           </w:rPr>
-          <w:t>1.1 GEX Current view</w:t>
+          <w:t>1.1 GEX Current view &amp; Starting Point</w:t>
         </w:r>
         <w:r>
           <w:rPr>
@@ -618,7 +658,7 @@
           <w:fldChar w:fldCharType="begin"/>
           <w:instrText xml:space="preserve"> PAGEREF _Toc241505177 \h </w:instrText>
           <w:fldChar w:fldCharType="separate"/>
-          <w:t>4</w:t>
+          <w:t/>
           <w:fldChar w:fldCharType="end"/>
         </w:r>
       </w:hyperlink>
@@ -648,7 +688,7 @@
             <w:rStyle w:val="Hyperlink"/>
             <w:noProof/>
           </w:rPr>
-          <w:t>1.2 Six facts from the engine</w:t>
+          <w:t>1.2 Six Gates facts, as of 27 September 2026</w:t>
         </w:r>
         <w:r>
           <w:rPr>
@@ -659,7 +699,7 @@
           <w:fldChar w:fldCharType="begin"/>
           <w:instrText xml:space="preserve"> PAGEREF _Toc241505178 \h </w:instrText>
           <w:fldChar w:fldCharType="separate"/>
-          <w:t>4</w:t>
+          <w:t/>
           <w:fldChar w:fldCharType="end"/>
         </w:r>
       </w:hyperlink>
@@ -700,7 +740,7 @@
           <w:fldChar w:fldCharType="begin"/>
           <w:instrText xml:space="preserve"> PAGEREF _Toc241505179 \h </w:instrText>
           <w:fldChar w:fldCharType="separate"/>
-          <w:t>5</w:t>
+          <w:t/>
           <w:fldChar w:fldCharType="end"/>
         </w:r>
       </w:hyperlink>
@@ -741,7 +781,7 @@
           <w:fldChar w:fldCharType="begin"/>
           <w:instrText xml:space="preserve"> PAGEREF _Toc241505180 \h </w:instrText>
           <w:fldChar w:fldCharType="separate"/>
-          <w:t>5</w:t>
+          <w:t/>
           <w:fldChar w:fldCharType="end"/>
         </w:r>
       </w:hyperlink>
@@ -782,7 +822,7 @@
           <w:fldChar w:fldCharType="begin"/>
           <w:instrText xml:space="preserve"> PAGEREF _Toc241505181 \h </w:instrText>
           <w:fldChar w:fldCharType="separate"/>
-          <w:t>6</w:t>
+          <w:t/>
           <w:fldChar w:fldCharType="end"/>
         </w:r>
       </w:hyperlink>
@@ -812,7 +852,7 @@
             <w:rStyle w:val="Hyperlink"/>
             <w:noProof/>
           </w:rPr>
-          <w:t>1.6 What should change, in one list</w:t>
+          <w:t>1.6 What changed: rules 4.0.0 and 4.1.0</w:t>
         </w:r>
         <w:r>
           <w:rPr>
@@ -823,7 +863,7 @@
           <w:fldChar w:fldCharType="begin"/>
           <w:instrText xml:space="preserve"> PAGEREF _Toc241505182 \h </w:instrText>
           <w:fldChar w:fldCharType="separate"/>
-          <w:t>6</w:t>
+          <w:t/>
           <w:fldChar w:fldCharType="end"/>
         </w:r>
       </w:hyperlink>
@@ -863,7 +903,7 @@
           <w:fldChar w:fldCharType="begin"/>
           <w:instrText xml:space="preserve"> PAGEREF _Toc241505183 \h </w:instrText>
           <w:fldChar w:fldCharType="separate"/>
-          <w:t>8</w:t>
+          <w:t/>
           <w:fldChar w:fldCharType="end"/>
         </w:r>
       </w:hyperlink>
@@ -904,7 +944,7 @@
           <w:fldChar w:fldCharType="begin"/>
           <w:instrText xml:space="preserve"> PAGEREF _Toc241505184 \h </w:instrText>
           <w:fldChar w:fldCharType="separate"/>
-          <w:t>8</w:t>
+          <w:t/>
           <w:fldChar w:fldCharType="end"/>
         </w:r>
       </w:hyperlink>
@@ -934,7 +974,7 @@
             <w:rStyle w:val="Hyperlink"/>
             <w:noProof/>
           </w:rPr>
-          <w:t>G1 · Power, Water &amp; Critical Utility Access</w:t>
+          <w:t>G1 · Power, Utilities &amp; Technology Basis</w:t>
         </w:r>
         <w:r>
           <w:rPr>
@@ -945,7 +985,7 @@
           <w:fldChar w:fldCharType="begin"/>
           <w:instrText xml:space="preserve"> PAGEREF _Toc241505185 \h </w:instrText>
           <w:fldChar w:fldCharType="separate"/>
-          <w:t>8</w:t>
+          <w:t/>
           <w:fldChar w:fldCharType="end"/>
         </w:r>
       </w:hyperlink>
@@ -986,7 +1026,7 @@
           <w:fldChar w:fldCharType="begin"/>
           <w:instrText xml:space="preserve"> PAGEREF _Toc241505186 \h </w:instrText>
           <w:fldChar w:fldCharType="separate"/>
-          <w:t>8</w:t>
+          <w:t/>
           <w:fldChar w:fldCharType="end"/>
         </w:r>
       </w:hyperlink>
@@ -1027,7 +1067,7 @@
           <w:fldChar w:fldCharType="begin"/>
           <w:instrText xml:space="preserve"> PAGEREF _Toc241505187 \h </w:instrText>
           <w:fldChar w:fldCharType="separate"/>
-          <w:t>9</w:t>
+          <w:t/>
           <w:fldChar w:fldCharType="end"/>
         </w:r>
       </w:hyperlink>
@@ -1068,7 +1108,7 @@
           <w:fldChar w:fldCharType="begin"/>
           <w:instrText xml:space="preserve"> PAGEREF _Toc241505188 \h </w:instrText>
           <w:fldChar w:fldCharType="separate"/>
-          <w:t>9</w:t>
+          <w:t/>
           <w:fldChar w:fldCharType="end"/>
         </w:r>
       </w:hyperlink>
@@ -1109,7 +1149,7 @@
           <w:fldChar w:fldCharType="begin"/>
           <w:instrText xml:space="preserve"> PAGEREF _Toc241505189 \h </w:instrText>
           <w:fldChar w:fldCharType="separate"/>
-          <w:t>10</w:t>
+          <w:t/>
           <w:fldChar w:fldCharType="end"/>
         </w:r>
       </w:hyperlink>
@@ -1150,7 +1190,7 @@
           <w:fldChar w:fldCharType="begin"/>
           <w:instrText xml:space="preserve"> PAGEREF _Toc241505190 \h </w:instrText>
           <w:fldChar w:fldCharType="separate"/>
-          <w:t>10</w:t>
+          <w:t/>
           <w:fldChar w:fldCharType="end"/>
         </w:r>
       </w:hyperlink>
@@ -1191,7 +1231,7 @@
           <w:fldChar w:fldCharType="begin"/>
           <w:instrText xml:space="preserve"> PAGEREF _Toc241505191 \h </w:instrText>
           <w:fldChar w:fldCharType="separate"/>
-          <w:t>10</w:t>
+          <w:t/>
           <w:fldChar w:fldCharType="end"/>
         </w:r>
       </w:hyperlink>
@@ -1232,7 +1272,7 @@
           <w:fldChar w:fldCharType="begin"/>
           <w:instrText xml:space="preserve"> PAGEREF _Toc241505192 \h </w:instrText>
           <w:fldChar w:fldCharType="separate"/>
-          <w:t>11</w:t>
+          <w:t/>
           <w:fldChar w:fldCharType="end"/>
         </w:r>
       </w:hyperlink>
@@ -1273,7 +1313,7 @@
           <w:fldChar w:fldCharType="begin"/>
           <w:instrText xml:space="preserve"> PAGEREF _Toc241505193 \h </w:instrText>
           <w:fldChar w:fldCharType="separate"/>
-          <w:t>11</w:t>
+          <w:t/>
           <w:fldChar w:fldCharType="end"/>
         </w:r>
       </w:hyperlink>
@@ -1314,7 +1354,7 @@
           <w:fldChar w:fldCharType="begin"/>
           <w:instrText xml:space="preserve"> PAGEREF _Toc241505194 \h </w:instrText>
           <w:fldChar w:fldCharType="separate"/>
-          <w:t>11</w:t>
+          <w:t/>
           <w:fldChar w:fldCharType="end"/>
         </w:r>
       </w:hyperlink>
@@ -1355,7 +1395,7 @@
           <w:fldChar w:fldCharType="begin"/>
           <w:instrText xml:space="preserve"> PAGEREF _Toc241505195 \h </w:instrText>
           <w:fldChar w:fldCharType="separate"/>
-          <w:t>12</w:t>
+          <w:t/>
           <w:fldChar w:fldCharType="end"/>
         </w:r>
       </w:hyperlink>
@@ -1395,7 +1435,7 @@
           <w:fldChar w:fldCharType="begin"/>
           <w:instrText xml:space="preserve"> PAGEREF _Toc241505196 \h </w:instrText>
           <w:fldChar w:fldCharType="separate"/>
-          <w:t>13</w:t>
+          <w:t/>
           <w:fldChar w:fldCharType="end"/>
         </w:r>
       </w:hyperlink>
@@ -1436,7 +1476,7 @@
           <w:fldChar w:fldCharType="begin"/>
           <w:instrText xml:space="preserve"> PAGEREF _Toc241505197 \h </w:instrText>
           <w:fldChar w:fldCharType="separate"/>
-          <w:t>13</w:t>
+          <w:t/>
           <w:fldChar w:fldCharType="end"/>
         </w:r>
       </w:hyperlink>
@@ -1466,7 +1506,7 @@
             <w:rStyle w:val="Hyperlink"/>
             <w:noProof/>
           </w:rPr>
-          <w:t>3.2 Who bears the risk — and what GEX should check</w:t>
+          <w:t>3.2 Who bears the risk — and what GEX checks</w:t>
         </w:r>
         <w:r>
           <w:rPr>
@@ -1477,7 +1517,7 @@
           <w:fldChar w:fldCharType="begin"/>
           <w:instrText xml:space="preserve"> PAGEREF _Toc241505198 \h </w:instrText>
           <w:fldChar w:fldCharType="separate"/>
-          <w:t>14</w:t>
+          <w:t/>
           <w:fldChar w:fldCharType="end"/>
         </w:r>
       </w:hyperlink>
@@ -1517,7 +1557,7 @@
           <w:fldChar w:fldCharType="begin"/>
           <w:instrText xml:space="preserve"> PAGEREF _Toc241505199 \h </w:instrText>
           <w:fldChar w:fldCharType="separate"/>
-          <w:t>15</w:t>
+          <w:t/>
           <w:fldChar w:fldCharType="end"/>
         </w:r>
       </w:hyperlink>
@@ -1558,7 +1598,7 @@
           <w:fldChar w:fldCharType="begin"/>
           <w:instrText xml:space="preserve"> PAGEREF _Toc241505200 \h </w:instrText>
           <w:fldChar w:fldCharType="separate"/>
-          <w:t>15</w:t>
+          <w:t/>
           <w:fldChar w:fldCharType="end"/>
         </w:r>
       </w:hyperlink>
@@ -1582,7 +1622,7 @@
           <w14:ligatures w14:val="standardContextual"/>
         </w:rPr>
       </w:pPr>
-      <w:hyperlink w:anchor="_Toc241505201" w:history="1">
+      <w:hyperlink w:anchor="_Toc2610220026" w:history="1">
         <w:r>
           <w:rPr>
             <w:rStyle w:val="Hyperlink"/>
@@ -1597,9 +1637,9 @@
           </w:rPr>
           <w:tab/>
           <w:fldChar w:fldCharType="begin"/>
-          <w:instrText xml:space="preserve"> PAGEREF _Toc241505201 \h </w:instrText>
+          <w:instrText xml:space="preserve"> PAGEREF _Toc2610220026 \h </w:instrText>
           <w:fldChar w:fldCharType="separate"/>
-          <w:t>16</w:t>
+          <w:t/>
           <w:fldChar w:fldCharType="end"/>
         </w:r>
       </w:hyperlink>
@@ -1623,7 +1663,7 @@
           <w14:ligatures w14:val="standardContextual"/>
         </w:rPr>
       </w:pPr>
-      <w:hyperlink w:anchor="_Toc241505202" w:history="1">
+      <w:hyperlink w:anchor="_Toc2610220027" w:history="1">
         <w:r>
           <w:rPr>
             <w:rStyle w:val="Hyperlink"/>
@@ -1638,9 +1678,9 @@
           </w:rPr>
           <w:tab/>
           <w:fldChar w:fldCharType="begin"/>
-          <w:instrText xml:space="preserve"> PAGEREF _Toc241505202 \h </w:instrText>
+          <w:instrText xml:space="preserve"> PAGEREF _Toc2610220027 \h </w:instrText>
           <w:fldChar w:fldCharType="separate"/>
-          <w:t>16</w:t>
+          <w:t/>
           <w:fldChar w:fldCharType="end"/>
         </w:r>
       </w:hyperlink>
@@ -1681,7 +1721,7 @@
           <w:fldChar w:fldCharType="begin"/>
           <w:instrText xml:space="preserve"> PAGEREF _Toc241505203 \h </w:instrText>
           <w:fldChar w:fldCharType="separate"/>
-          <w:t>17</w:t>
+          <w:t/>
           <w:fldChar w:fldCharType="end"/>
         </w:r>
       </w:hyperlink>
@@ -1721,7 +1761,7 @@
           <w:fldChar w:fldCharType="begin"/>
           <w:instrText xml:space="preserve"> PAGEREF _Toc241505204 \h </w:instrText>
           <w:fldChar w:fldCharType="separate"/>
-          <w:t>18</w:t>
+          <w:t/>
           <w:fldChar w:fldCharType="end"/>
         </w:r>
       </w:hyperlink>
@@ -1761,7 +1801,7 @@
           <w:fldChar w:fldCharType="begin"/>
           <w:instrText xml:space="preserve"> PAGEREF _Toc241505205 \h </w:instrText>
           <w:fldChar w:fldCharType="separate"/>
-          <w:t>19</w:t>
+          <w:t/>
           <w:fldChar w:fldCharType="end"/>
         </w:r>
       </w:hyperlink>
@@ -1802,7 +1842,7 @@
           <w:fldChar w:fldCharType="begin"/>
           <w:instrText xml:space="preserve"> PAGEREF _Toc241505206 \h </w:instrText>
           <w:fldChar w:fldCharType="separate"/>
-          <w:t>20</w:t>
+          <w:t/>
           <w:fldChar w:fldCharType="end"/>
         </w:r>
       </w:hyperlink>
@@ -1842,7 +1882,7 @@
           <w:fldChar w:fldCharType="begin"/>
           <w:instrText xml:space="preserve"> PAGEREF _Toc241505207 \h </w:instrText>
           <w:fldChar w:fldCharType="separate"/>
-          <w:t>21</w:t>
+          <w:t/>
           <w:fldChar w:fldCharType="end"/>
         </w:r>
       </w:hyperlink>
@@ -1883,7 +1923,7 @@
           <w:fldChar w:fldCharType="begin"/>
           <w:instrText xml:space="preserve"> PAGEREF _Toc241505208 \h </w:instrText>
           <w:fldChar w:fldCharType="separate"/>
-          <w:t>22</w:t>
+          <w:t/>
           <w:fldChar w:fldCharType="end"/>
         </w:r>
       </w:hyperlink>
@@ -1923,7 +1963,7 @@
           <w:fldChar w:fldCharType="begin"/>
           <w:instrText xml:space="preserve"> PAGEREF _Toc241505209 \h </w:instrText>
           <w:fldChar w:fldCharType="separate"/>
-          <w:t>23</w:t>
+          <w:t/>
           <w:fldChar w:fldCharType="end"/>
         </w:r>
       </w:hyperlink>
@@ -1964,7 +2004,7 @@
           <w:fldChar w:fldCharType="begin"/>
           <w:instrText xml:space="preserve"> PAGEREF _Toc241505210 \h </w:instrText>
           <w:fldChar w:fldCharType="separate"/>
-          <w:t>23</w:t>
+          <w:t/>
           <w:fldChar w:fldCharType="end"/>
         </w:r>
       </w:hyperlink>
@@ -2005,7 +2045,7 @@
           <w:fldChar w:fldCharType="begin"/>
           <w:instrText xml:space="preserve"> PAGEREF _Toc241505211 \h </w:instrText>
           <w:fldChar w:fldCharType="separate"/>
-          <w:t>23</w:t>
+          <w:t/>
           <w:fldChar w:fldCharType="end"/>
         </w:r>
       </w:hyperlink>
@@ -2046,7 +2086,7 @@
           <w:fldChar w:fldCharType="begin"/>
           <w:instrText xml:space="preserve"> PAGEREF _Toc241505212 \h </w:instrText>
           <w:fldChar w:fldCharType="separate"/>
-          <w:t>24</w:t>
+          <w:t/>
           <w:fldChar w:fldCharType="end"/>
         </w:r>
       </w:hyperlink>
@@ -2087,7 +2127,7 @@
           <w:fldChar w:fldCharType="begin"/>
           <w:instrText xml:space="preserve"> PAGEREF _Toc241505213 \h </w:instrText>
           <w:fldChar w:fldCharType="separate"/>
-          <w:t>24</w:t>
+          <w:t/>
           <w:fldChar w:fldCharType="end"/>
         </w:r>
       </w:hyperlink>
@@ -2098,6 +2138,7 @@
         <w:tabs>
           <w:tab w:val="right" w:leader="dot" w:pos="9350"/>
         </w:tabs>
+        <w:spacing w:before="0"/>
         <w:rPr>
           <w:rFonts w:eastAsiaTheme="minorEastAsia" w:cstheme="minorBidi"/>
           <w:b w:val="0"/>
@@ -2110,7 +2151,7 @@
           <w14:ligatures w14:val="standardContextual"/>
         </w:rPr>
       </w:pPr>
-      <w:hyperlink w:anchor="_Toc241505214" w:history="1">
+      <w:hyperlink w:anchor="_Toc2610220039" w:history="1">
         <w:r>
           <w:rPr>
             <w:rStyle w:val="Hyperlink"/>
@@ -2125,9 +2166,9 @@
           </w:rPr>
           <w:tab/>
           <w:fldChar w:fldCharType="begin"/>
-          <w:instrText xml:space="preserve"> PAGEREF _Toc241505214 \h </w:instrText>
+          <w:instrText xml:space="preserve"> PAGEREF _Toc2610220039 \h </w:instrText>
           <w:fldChar w:fldCharType="separate"/>
-          <w:t>25</w:t>
+          <w:t/>
           <w:fldChar w:fldCharType="end"/>
         </w:r>
       </w:hyperlink>
@@ -2138,6 +2179,7 @@
         <w:tabs>
           <w:tab w:val="right" w:leader="dot" w:pos="9350"/>
         </w:tabs>
+        <w:spacing w:before="0"/>
         <w:rPr>
           <w:rFonts w:eastAsiaTheme="minorEastAsia" w:cstheme="minorBidi"/>
           <w:b w:val="0"/>
@@ -2156,7 +2198,7 @@
             <w:rStyle w:val="Hyperlink"/>
             <w:noProof/>
           </w:rPr>
-          <w:t>8.6 What it would take in GEX</w:t>
+          <w:t>8.6 What GEX does and does not decide</w:t>
         </w:r>
         <w:r>
           <w:rPr>
@@ -2167,7 +2209,7 @@
           <w:fldChar w:fldCharType="begin"/>
           <w:instrText xml:space="preserve"> PAGEREF _Toc241505215 \h </w:instrText>
           <w:fldChar w:fldCharType="separate"/>
-          <w:t>25</w:t>
+          <w:t/>
           <w:fldChar w:fldCharType="end"/>
         </w:r>
       </w:hyperlink>
@@ -2178,6 +2220,7 @@
         <w:tabs>
           <w:tab w:val="right" w:leader="dot" w:pos="9350"/>
         </w:tabs>
+        <w:spacing w:before="0"/>
         <w:rPr>
           <w:rFonts w:asciiTheme="minorHAnsi" w:eastAsiaTheme="minorEastAsia" w:hAnsiTheme="minorHAnsi" w:cstheme="minorBidi"/>
           <w:b w:val="0"/>
@@ -2206,7 +2249,7 @@
           <w:fldChar w:fldCharType="begin"/>
           <w:instrText xml:space="preserve"> PAGEREF _Toc241505216 \h </w:instrText>
           <w:fldChar w:fldCharType="separate"/>
-          <w:t>25</w:t>
+          <w:t/>
           <w:fldChar w:fldCharType="end"/>
         </w:r>
       </w:hyperlink>
@@ -2217,6 +2260,7 @@
         <w:tabs>
           <w:tab w:val="right" w:leader="dot" w:pos="9350"/>
         </w:tabs>
+        <w:spacing w:before="0"/>
         <w:rPr>
           <w:rFonts w:asciiTheme="minorHAnsi" w:eastAsiaTheme="minorEastAsia" w:hAnsiTheme="minorHAnsi" w:cstheme="minorBidi"/>
           <w:b w:val="0"/>
@@ -2228,13 +2272,53 @@
           <w14:ligatures w14:val="standardContextual"/>
         </w:rPr>
       </w:pPr>
+      <w:hyperlink w:anchor="_Toc241661560" w:history="1">
+        <w:r>
+          <w:rPr>
+            <w:rStyle w:val="Hyperlink"/>
+            <w:noProof/>
+          </w:rPr>
+          <w:t>10. Lessons from the EU Hydrogen Bank</w:t>
+        </w:r>
+        <w:r>
+          <w:rPr>
+            <w:noProof/>
+            <w:webHidden/>
+          </w:rPr>
+          <w:tab/>
+          <w:fldChar w:fldCharType="begin"/>
+          <w:instrText xml:space="preserve"> PAGEREF _Toc241661560 \h </w:instrText>
+          <w:fldChar w:fldCharType="separate"/>
+          <w:t/>
+          <w:fldChar w:fldCharType="end"/>
+        </w:r>
+      </w:hyperlink>
+    </w:p>
+    <w:p>
+      <w:pPr>
+        <w:pStyle w:val="TOC1"/>
+        <w:tabs>
+          <w:tab w:val="right" w:leader="dot" w:pos="9350"/>
+        </w:tabs>
+        <w:spacing w:before="0"/>
+        <w:rPr>
+          <w:rFonts w:asciiTheme="minorHAnsi" w:eastAsiaTheme="minorEastAsia" w:hAnsiTheme="minorHAnsi" w:cstheme="minorBidi"/>
+          <w:b w:val="0"/>
+          <w:bCs w:val="0"/>
+          <w:caps w:val="0"/>
+          <w:noProof/>
+          <w:color w:val="auto"/>
+          <w:kern w:val="2"/>
+          <w14:ligatures w14:val="standardContextual"/>
+        </w:rPr>
+      </w:pPr>
       <w:hyperlink w:anchor="_Toc241505217" w:history="1">
         <w:r>
           <w:rPr>
             <w:rStyle w:val="Hyperlink"/>
             <w:noProof/>
           </w:rPr>
-          <w:t>10. Sources</w:t>
+          <w:t>11. Sources</w:t>
         </w:r>
         <w:r>
           <w:rPr>
@@ -2245,7 +2329,168 @@
           <w:fldChar w:fldCharType="begin"/>
           <w:instrText xml:space="preserve"> PAGEREF _Toc241505217 \h </w:instrText>
           <w:fldChar w:fldCharType="separate"/>
-          <w:t>25</w:t>
+          <w:t/>
+          <w:fldChar w:fldCharType="end"/>
+        </w:r>
+      </w:hyperlink>
+    </w:p>
+    <w:p>
+      <w:pPr>
+        <w:pStyle w:val="TOC1"/>
+        <w:tabs>
+          <w:tab w:val="right" w:leader="dot" w:pos="9350"/>
+        </w:tabs>
+        <w:spacing w:before="0"/>
+        <w:rPr>
+          <w:rFonts w:asciiTheme="minorHAnsi" w:eastAsiaTheme="minorEastAsia" w:hAnsiTheme="minorHAnsi" w:cstheme="minorBidi"/>
+          <w:b w:val="0"/>
+          <w:bCs w:val="0"/>
+          <w:caps w:val="0"/>
+          <w:noProof/>
+          <w:color w:val="auto"/>
+          <w:kern w:val="2"/>
+          <w14:ligatures w14:val="standardContextual"/>
+        </w:rPr>
+      </w:pPr>
+      <w:hyperlink w:anchor="_Toc241661562" w:history="1">
+        <w:r>
+          <w:rPr>
+            <w:rStyle w:val="Hyperlink"/>
+            <w:noProof/>
+          </w:rPr>
+          <w:t>Annex A · After the gates: how capital is released</w:t>
+        </w:r>
+        <w:r>
+          <w:rPr>
+            <w:noProof/>
+            <w:webHidden/>
+          </w:rPr>
+          <w:tab/>
+          <w:fldChar w:fldCharType="begin"/>
+          <w:instrText xml:space="preserve"> PAGEREF _Toc241661562 \h </w:instrText>
+          <w:fldChar w:fldCharType="separate"/>
+          <w:t/>
+          <w:fldChar w:fldCharType="end"/>
+        </w:r>
+      </w:hyperlink>
+    </w:p>
+    <w:p>
+      <w:pPr>
+        <w:pStyle w:val="TOC1"/>
+        <w:tabs>
+          <w:tab w:val="right" w:leader="dot" w:pos="9350"/>
+        </w:tabs>
+        <w:spacing w:before="0"/>
+        <w:rPr>
+          <w:rFonts w:asciiTheme="minorHAnsi" w:eastAsiaTheme="minorEastAsia" w:hAnsiTheme="minorHAnsi" w:cstheme="minorBidi"/>
+          <w:b w:val="0"/>
+          <w:bCs w:val="0"/>
+          <w:caps w:val="0"/>
+          <w:noProof/>
+          <w:color w:val="auto"/>
+          <w:kern w:val="2"/>
+          <w14:ligatures w14:val="standardContextual"/>
+        </w:rPr>
+      </w:pPr>
+      <w:hyperlink w:anchor="_Toc241661563" w:history="1">
+        <w:r>
+          <w:rPr>
+            <w:rStyle w:val="Hyperlink"/>
+            <w:noProof/>
+          </w:rPr>
+          <w:t>Annex B · Illustrative heads-of-terms templates</w:t>
+        </w:r>
+        <w:r>
+          <w:rPr>
+            <w:noProof/>
+            <w:webHidden/>
+          </w:rPr>
+          <w:tab/>
+          <w:fldChar w:fldCharType="begin"/>
+          <w:instrText xml:space="preserve"> PAGEREF _Toc241661563 \h </w:instrText>
+          <w:fldChar w:fldCharType="separate"/>
+          <w:t/>
+          <w:fldChar w:fldCharType="end"/>
+        </w:r>
+      </w:hyperlink>
+    </w:p>
+    <w:p>
+      <w:pPr>
+        <w:pStyle w:val="TOC2"/>
+        <w:tabs>
+          <w:tab w:val="right" w:leader="dot" w:pos="9350"/>
+        </w:tabs>
+        <w:spacing w:before="0"/>
+        <w:rPr>
+          <w:rFonts w:eastAsiaTheme="minorEastAsia" w:cstheme="minorBidi"/>
+          <w:b w:val="0"/>
+          <w:bCs w:val="0"/>
+          <w:noProof/>
+          <w:color w:val="auto"/>
+          <w:kern w:val="2"/>
+          <w:sz w:val="24"/>
+          <w:szCs w:val="24"/>
+          <w14:ligatures w14:val="standardContextual"/>
+        </w:rPr>
+      </w:pPr>
+      <w:hyperlink w:anchor="_Toc2610220046" w:history="1">
+        <w:r>
+          <w:rPr>
+            <w:rStyle w:val="Hyperlink"/>
+            <w:noProof/>
+          </w:rPr>
+          <w:t>Examples</w:t>
+        </w:r>
+        <w:r>
+          <w:rPr>
+            <w:noProof/>
+            <w:webHidden/>
+          </w:rPr>
+          <w:tab/>
+          <w:fldChar w:fldCharType="begin"/>
+          <w:instrText xml:space="preserve"> PAGEREF _Toc2610220046 \h </w:instrText>
+          <w:fldChar w:fldCharType="separate"/>
+          <w:t/>
+          <w:fldChar w:fldCharType="end"/>
+        </w:r>
+      </w:hyperlink>
+    </w:p>
+    <w:p>
+      <w:pPr>
+        <w:pStyle w:val="TOC1"/>
+        <w:tabs>
+          <w:tab w:val="right" w:leader="dot" w:pos="9350"/>
+        </w:tabs>
+        <w:spacing w:before="0"/>
+        <w:rPr>
+          <w:rFonts w:asciiTheme="minorHAnsi" w:eastAsiaTheme="minorEastAsia" w:hAnsiTheme="minorHAnsi" w:cstheme="minorBidi"/>
+          <w:b w:val="0"/>
+          <w:bCs w:val="0"/>
+          <w:caps w:val="0"/>
+          <w:noProof/>
+          <w:color w:val="auto"/>
+          <w:kern w:val="2"/>
+          <w14:ligatures w14:val="standardContextual"/>
+        </w:rPr>
+      </w:pPr>
+      <w:hyperlink w:anchor="_Toc241661564" w:history="1">
+        <w:r>
+          <w:rPr>
+            <w:rStyle w:val="Hyperlink"/>
+            <w:noProof/>
+          </w:rPr>
+          <w:t>Annex C · Glossary of GEX terms</w:t>
+        </w:r>
+        <w:r>
+          <w:rPr>
+            <w:noProof/>
+            <w:webHidden/>
+          </w:rPr>
+          <w:tab/>
+          <w:fldChar w:fldCharType="begin"/>
+          <w:instrText xml:space="preserve"> PAGEREF _Toc241661564 \h </w:instrText>
+          <w:fldChar w:fldCharType="separate"/>
+          <w:t/>
           <w:fldChar w:fldCharType="end"/>
         </w:r>
       </w:hyperlink>
@@ -3965,6 +4210,7 @@
         <w:keepNext/>
         <w:spacing w:after="160"/>
       </w:pPr>
+      <w:bookmarkStart w:id="52" w:name="_Toc2610220001"/>
       <w:r>
         <w:t xml:space="preserve">1. Executive Summary </w:t>
       </w:r>
@@ -3972,6 +4218,7 @@
       <w:r>
         <w:t xml:space="preserve">- Reasoning for the Gates</w:t>
       </w:r>
+      <w:bookmarkEnd w:id="52"/>
     </w:p>
     <w:p>
       <w:pPr>
@@ -6022,7 +6269,7 @@
       </w:pPr>
       <w:bookmarkStart w:id="11" w:name="_Toc241505185"/>
       <w:r>
-        <w:t>G1 · Power, Water &amp; Critical Utility Access</w:t>
+        <w:t>G1 · Power, Utilities &amp; Technology Basis</w:t>
       </w:r>
       <w:bookmarkEnd w:id="11"/>
     </w:p>
@@ -16149,10 +16396,12 @@
         <w:keepNext/>
         <w:spacing w:before="260" w:after="100"/>
       </w:pPr>
+      <w:bookmarkStart w:id="53" w:name="_Toc2610220026"/>
       <w:r>
         <w:t>4.2 The offtake quality card</w:t>
       </w:r>
       <w:bookmarkEnd w:id="28"/>
+      <w:bookmarkEnd w:id="53"/>
     </w:p>
     <w:p>
       <w:pPr>
@@ -17005,10 +17254,12 @@
         <w:keepNext/>
         <w:spacing w:before="260" w:after="100"/>
       </w:pPr>
+      <w:bookmarkStart w:id="54" w:name="_Toc2610220027"/>
       <w:r>
         <w:t>4.3 The offtaker’s own readiness</w:t>
       </w:r>
       <w:bookmarkEnd w:id="29"/>
+      <w:bookmarkEnd w:id="54"/>
     </w:p>
     <w:tbl>
       <w:tblPr>
@@ -30797,10 +31048,12 @@
         <w:keepNext/>
         <w:spacing w:before="260" w:after="100"/>
       </w:pPr>
+      <w:bookmarkStart w:id="55" w:name="_Toc2610220039"/>
       <w:r>
         <w:t>8.5 What not to do</w:t>
       </w:r>
       <w:bookmarkEnd w:id="41"/>
+      <w:bookmarkEnd w:id="55"/>
     </w:p>
     <w:p>
       <w:pPr>
@@ -36430,9 +36683,11 @@
       <w:pPr>
         <w:pStyle w:val="Heading2"/>
       </w:pPr>
+      <w:bookmarkStart w:id="56" w:name="_Toc2610220046"/>
       <w:r>
         <w:t xml:space="preserve">Examples </w:t>
       </w:r>
+      <w:bookmarkEnd w:id="56"/>
     </w:p>
     <w:p>
       <w:pPr>

</xml_diff>